<commit_message>
Show both completeness values everywhere.
</commit_message>
<xml_diff>
--- a/finalcif/template/report_default.docx
+++ b/finalcif/template/report_default.docx
@@ -18,27 +18,42 @@
         <w:t xml:space="preserve">{%if </w:t>
       </w:r>
       <w:proofErr w:type="spellStart"/>
+      <w:proofErr w:type="gramStart"/>
       <w:r>
         <w:rPr>
           <w:color w:val="C00000"/>
           <w:sz w:val="16"/>
           <w:szCs w:val="20"/>
         </w:rPr>
-        <w:t>options.report_text</w:t>
-      </w:r>
-      <w:proofErr w:type="spellEnd"/>
-      <w:r>
-        <w:rPr>
+        <w:t>options.report</w:t>
+      </w:r>
+      <w:proofErr w:type="gramEnd"/>
+      <w:r>
+        <w:rPr>
+          <w:color w:val="C00000"/>
           <w:sz w:val="16"/>
           <w:szCs w:val="20"/>
         </w:rPr>
+        <w:t>_text</w:t>
+      </w:r>
+      <w:proofErr w:type="spellEnd"/>
+      <w:r>
+        <w:rPr>
+          <w:sz w:val="16"/>
+          <w:szCs w:val="20"/>
+        </w:rPr>
         <w:t xml:space="preserve"> </w:t>
       </w:r>
+      <w:proofErr w:type="gramStart"/>
       <w:r>
         <w:t>%}</w:t>
       </w:r>
       <w:r>
-        <w:t xml:space="preserve">{% if </w:t>
+        <w:t>{</w:t>
+      </w:r>
+      <w:proofErr w:type="gramEnd"/>
+      <w:r>
+        <w:t xml:space="preserve">% if </w:t>
       </w:r>
       <w:proofErr w:type="spellStart"/>
       <w:r>
@@ -49,7 +64,15 @@
       </w:r>
       <w:proofErr w:type="spellEnd"/>
       <w:r>
-        <w:t xml:space="preserve"> %}{{</w:t>
+        <w:t xml:space="preserve"> </w:t>
+      </w:r>
+      <w:proofErr w:type="gramStart"/>
+      <w:r>
+        <w:t>%}{</w:t>
+      </w:r>
+      <w:proofErr w:type="gramEnd"/>
+      <w:r>
+        <w:t>{</w:t>
       </w:r>
       <w:proofErr w:type="spellStart"/>
       <w:r>
@@ -82,11 +105,16 @@
         </w:rPr>
         <w:t xml:space="preserve"> </w:t>
       </w:r>
+      <w:proofErr w:type="gramStart"/>
       <w:r>
         <w:t>%}</w:t>
       </w:r>
       <w:r>
-        <w:t xml:space="preserve">{% </w:t>
+        <w:t>{</w:t>
+      </w:r>
+      <w:proofErr w:type="gramEnd"/>
+      <w:r>
+        <w:t xml:space="preserve">% </w:t>
       </w:r>
       <w:r>
         <w:rPr>
@@ -107,6 +135,7 @@
       <w:r>
         <w:t xml:space="preserve"> </w:t>
       </w:r>
+      <w:proofErr w:type="gramStart"/>
       <w:r>
         <w:t>%}</w:t>
       </w:r>
@@ -122,7 +151,21 @@
         <w:rPr>
           <w:sz w:val="14"/>
         </w:rPr>
-        <w:t>crystallization_method</w:t>
+        <w:t>crystallization</w:t>
+      </w:r>
+      <w:proofErr w:type="gramEnd"/>
+      <w:r>
+        <w:rPr>
+          <w:sz w:val="14"/>
+        </w:rPr>
+        <w:t>_</w:t>
+      </w:r>
+      <w:proofErr w:type="gramStart"/>
+      <w:r>
+        <w:rPr>
+          <w:sz w:val="14"/>
+        </w:rPr>
+        <w:t>method</w:t>
       </w:r>
       <w:proofErr w:type="spellEnd"/>
       <w:r>
@@ -133,7 +176,11 @@
       </w:r>
       <w:bookmarkEnd w:id="0"/>
       <w:r>
-        <w:t>}}.</w:t>
+        <w:t>}</w:t>
+      </w:r>
+      <w:proofErr w:type="gramEnd"/>
+      <w:r>
+        <w:t>}.</w:t>
       </w:r>
       <w:r>
         <w:t xml:space="preserve"> {% </w:t>
@@ -553,6 +600,7 @@
         </w:rPr>
         <w:t xml:space="preserve"> </w:t>
       </w:r>
+      <w:proofErr w:type="gramStart"/>
       <w:r>
         <w:rPr>
           <w:sz w:val="12"/>
@@ -563,7 +611,11 @@
         <w:t>}</w:t>
       </w:r>
       <w:r>
-        <w:t xml:space="preserve">was equipped with </w:t>
+        <w:t>was</w:t>
+      </w:r>
+      <w:proofErr w:type="gramEnd"/>
+      <w:r>
+        <w:t xml:space="preserve"> equipped with </w:t>
       </w:r>
       <w:r>
         <w:t>{{</w:t>
@@ -617,6 +669,7 @@
         </w:rPr>
         <w:t>endif</w:t>
       </w:r>
+      <w:proofErr w:type="gramStart"/>
       <w:r>
         <w:rPr>
           <w:sz w:val="12"/>
@@ -627,7 +680,11 @@
         <w:t>}</w:t>
       </w:r>
       <w:r>
-        <w:t xml:space="preserve">used </w:t>
+        <w:t>used</w:t>
+      </w:r>
+      <w:proofErr w:type="gramEnd"/>
+      <w:r>
+        <w:t xml:space="preserve"> </w:t>
       </w:r>
       <w:r>
         <w:t>{{</w:t>
@@ -642,13 +699,24 @@
         <w:t>}}</w:t>
       </w:r>
       <w:r>
-        <w:t xml:space="preserve"> radiation</w:t>
+        <w:t xml:space="preserve"> </w:t>
+      </w:r>
+      <w:proofErr w:type="gramStart"/>
+      <w:r>
+        <w:t>radiation</w:t>
       </w:r>
       <w:r>
         <w:rPr>
           <w:sz w:val="12"/>
         </w:rPr>
-        <w:t>{%</w:t>
+        <w:t>{</w:t>
+      </w:r>
+      <w:proofErr w:type="gramEnd"/>
+      <w:r>
+        <w:rPr>
+          <w:sz w:val="12"/>
+        </w:rPr>
+        <w:t>%</w:t>
       </w:r>
       <w:r>
         <w:rPr>
@@ -717,7 +785,11 @@
       </w:r>
       <w:proofErr w:type="spellEnd"/>
       <w:r>
-        <w:t>}}</w:t>
+        <w:t>}</w:t>
+      </w:r>
+      <w:proofErr w:type="gramStart"/>
+      <w:r>
+        <w:t>}</w:t>
       </w:r>
       <w:r>
         <w:t>)</w:t>
@@ -726,7 +798,14 @@
         <w:rPr>
           <w:sz w:val="14"/>
         </w:rPr>
-        <w:t>{%</w:t>
+        <w:t>{</w:t>
+      </w:r>
+      <w:proofErr w:type="gramEnd"/>
+      <w:r>
+        <w:rPr>
+          <w:sz w:val="14"/>
+        </w:rPr>
+        <w:t>%</w:t>
       </w:r>
       <w:r>
         <w:rPr>
@@ -1481,6 +1560,7 @@
         </w:rPr>
         <w:t xml:space="preserve"> </w:t>
       </w:r>
+      <w:proofErr w:type="gramStart"/>
       <w:r>
         <w:rPr>
           <w:sz w:val="16"/>
@@ -1502,11 +1582,13 @@
         </w:rPr>
         <w:t>}</w:t>
       </w:r>
+      <w:proofErr w:type="gramEnd"/>
     </w:p>
     <w:p>
       <w:pPr>
         <w:pStyle w:val="BodyText1"/>
       </w:pPr>
+      <w:proofErr w:type="gramStart"/>
       <w:r>
         <w:t>{{</w:t>
       </w:r>
@@ -1518,19 +1600,28 @@
         <w:t>cif</w:t>
       </w:r>
       <w:proofErr w:type="spellEnd"/>
+      <w:proofErr w:type="gramEnd"/>
       <w:r>
         <w:t>._</w:t>
       </w:r>
       <w:proofErr w:type="spellStart"/>
       <w:r>
-        <w:t>database_code_depnum_ccdc_archive</w:t>
+        <w:t>database_code_depnum_ccdc_</w:t>
+      </w:r>
+      <w:proofErr w:type="gramStart"/>
+      <w:r>
+        <w:t>archive</w:t>
       </w:r>
       <w:proofErr w:type="spellEnd"/>
       <w:r>
         <w:t xml:space="preserve"> </w:t>
       </w:r>
       <w:r>
-        <w:t>}}</w:t>
+        <w:t>}</w:t>
+      </w:r>
+      <w:proofErr w:type="gramEnd"/>
+      <w:r>
+        <w:t>}</w:t>
       </w:r>
       <w:r>
         <w:t xml:space="preserve"> </w:t>
@@ -1580,6 +1671,7 @@
         </w:rPr>
         <w:t xml:space="preserve"> </w:t>
       </w:r>
+      <w:proofErr w:type="gramStart"/>
       <w:r>
         <w:rPr>
           <w:sz w:val="16"/>
@@ -1601,6 +1693,7 @@
         </w:rPr>
         <w:t>}</w:t>
       </w:r>
+      <w:proofErr w:type="gramEnd"/>
       <w:r>
         <w:t>??????</w:t>
       </w:r>
@@ -1643,6 +1736,7 @@
         </w:rPr>
         <w:t xml:space="preserve"> </w:t>
       </w:r>
+      <w:proofErr w:type="gramStart"/>
       <w:r>
         <w:rPr>
           <w:sz w:val="16"/>
@@ -1664,6 +1758,7 @@
         </w:rPr>
         <w:t>}</w:t>
       </w:r>
+      <w:proofErr w:type="gramEnd"/>
     </w:p>
     <w:p>
       <w:pPr>
@@ -1679,7 +1774,11 @@
         <w:t>‌</w:t>
       </w:r>
       <w:r>
-        <w:t>structures. This report and the CIF file were generated using FinalCif.</w:t>
+        <w:t xml:space="preserve">structures. This report and the CIF file were generated using </w:t>
+      </w:r>
+      <w:proofErr w:type="gramStart"/>
+      <w:r>
+        <w:t>FinalCif.</w:t>
       </w:r>
       <w:r>
         <w:rPr>
@@ -1687,6 +1786,7 @@
         </w:rPr>
         <w:t>[</w:t>
       </w:r>
+      <w:proofErr w:type="gramEnd"/>
       <w:r>
         <w:rPr>
           <w:vertAlign w:val="superscript"/>
@@ -1694,11 +1794,19 @@
         <w:t>{{</w:t>
       </w:r>
       <w:proofErr w:type="spellStart"/>
+      <w:proofErr w:type="gramStart"/>
       <w:r>
         <w:rPr>
           <w:vertAlign w:val="superscript"/>
         </w:rPr>
-        <w:t>literature.finalcif|ref_num</w:t>
+        <w:t>literature.finalcif</w:t>
+      </w:r>
+      <w:proofErr w:type="gramEnd"/>
+      <w:r>
+        <w:rPr>
+          <w:vertAlign w:val="superscript"/>
+        </w:rPr>
+        <w:t>|ref_num</w:t>
       </w:r>
       <w:proofErr w:type="spellEnd"/>
       <w:r>
@@ -1735,11 +1843,16 @@
         </w:rPr>
         <w:t xml:space="preserve">endif </w:t>
       </w:r>
+      <w:proofErr w:type="gramStart"/>
       <w:r>
         <w:t>%}</w:t>
       </w:r>
       <w:r>
-        <w:t xml:space="preserve">Table </w:t>
+        <w:t>Table</w:t>
+      </w:r>
+      <w:proofErr w:type="gramEnd"/>
+      <w:r>
+        <w:t xml:space="preserve"> </w:t>
       </w:r>
       <w:r>
         <w:fldChar w:fldCharType="begin"/>
@@ -1780,6 +1893,7 @@
       <w:r>
         <w:t xml:space="preserve"> </w:t>
       </w:r>
+      <w:proofErr w:type="gramStart"/>
       <w:r>
         <w:t>{{</w:t>
       </w:r>
@@ -1787,7 +1901,11 @@
         <w:t xml:space="preserve"> </w:t>
       </w:r>
       <w:r>
-        <w:t xml:space="preserve">cif.block.name </w:t>
+        <w:t>cif.block.name</w:t>
+      </w:r>
+      <w:proofErr w:type="gramEnd"/>
+      <w:r>
+        <w:t xml:space="preserve"> </w:t>
       </w:r>
       <w:r>
         <w:t>}}</w:t>
@@ -1800,8 +1918,8 @@
         <w:tblLook w:val="04A0" w:firstRow="1" w:lastRow="0" w:firstColumn="1" w:lastColumn="0" w:noHBand="0" w:noVBand="1"/>
       </w:tblPr>
       <w:tblGrid>
-        <w:gridCol w:w="2267"/>
-        <w:gridCol w:w="2267"/>
+        <w:gridCol w:w="2405"/>
+        <w:gridCol w:w="2129"/>
       </w:tblGrid>
       <w:tr>
         <w:trPr>
@@ -1809,7 +1927,7 @@
         </w:trPr>
         <w:tc>
           <w:tcPr>
-            <w:tcW w:w="2267" w:type="dxa"/>
+            <w:tcW w:w="2405" w:type="dxa"/>
           </w:tcPr>
           <w:p>
             <w:pPr>
@@ -1822,7 +1940,7 @@
         </w:tc>
         <w:tc>
           <w:tcPr>
-            <w:tcW w:w="2267" w:type="dxa"/>
+            <w:tcW w:w="2129" w:type="dxa"/>
           </w:tcPr>
           <w:p>
             <w:pPr>
@@ -1831,6 +1949,7 @@
                 <w:lang w:val="fr-FR"/>
               </w:rPr>
             </w:pPr>
+            <w:proofErr w:type="gramStart"/>
             <w:r>
               <w:rPr>
                 <w:lang w:val="fr-FR"/>
@@ -1847,6 +1966,7 @@
               <w:t>cif</w:t>
             </w:r>
             <w:proofErr w:type="spellEnd"/>
+            <w:proofErr w:type="gramEnd"/>
             <w:r>
               <w:rPr>
                 <w:sz w:val="8"/>
@@ -1887,7 +2007,7 @@
         </w:trPr>
         <w:tc>
           <w:tcPr>
-            <w:tcW w:w="2267" w:type="dxa"/>
+            <w:tcW w:w="2405" w:type="dxa"/>
           </w:tcPr>
           <w:p>
             <w:pPr>
@@ -1900,12 +2020,13 @@
         </w:tc>
         <w:tc>
           <w:tcPr>
-            <w:tcW w:w="2267" w:type="dxa"/>
+            <w:tcW w:w="2129" w:type="dxa"/>
           </w:tcPr>
           <w:p>
             <w:pPr>
               <w:pStyle w:val="tabletext"/>
             </w:pPr>
+            <w:proofErr w:type="gramStart"/>
             <w:r>
               <w:t xml:space="preserve">{{ </w:t>
             </w:r>
@@ -1914,7 +2035,14 @@
               <w:rPr>
                 <w:sz w:val="12"/>
               </w:rPr>
-              <w:t>sum_formula</w:t>
+              <w:t>sum</w:t>
+            </w:r>
+            <w:proofErr w:type="gramEnd"/>
+            <w:r>
+              <w:rPr>
+                <w:sz w:val="12"/>
+              </w:rPr>
+              <w:t>_formula</w:t>
             </w:r>
             <w:proofErr w:type="spellEnd"/>
             <w:r>
@@ -1929,7 +2057,7 @@
         </w:trPr>
         <w:tc>
           <w:tcPr>
-            <w:tcW w:w="2267" w:type="dxa"/>
+            <w:tcW w:w="2405" w:type="dxa"/>
           </w:tcPr>
           <w:p>
             <w:pPr>
@@ -1942,7 +2070,7 @@
         </w:tc>
         <w:tc>
           <w:tcPr>
-            <w:tcW w:w="2267" w:type="dxa"/>
+            <w:tcW w:w="2129" w:type="dxa"/>
           </w:tcPr>
           <w:p>
             <w:pPr>
@@ -1952,6 +2080,7 @@
               <w:t>{{</w:t>
             </w:r>
             <w:proofErr w:type="spellStart"/>
+            <w:proofErr w:type="gramStart"/>
             <w:r>
               <w:rPr>
                 <w:sz w:val="10"/>
@@ -1966,6 +2095,7 @@
               <w:t>._</w:t>
             </w:r>
             <w:proofErr w:type="spellStart"/>
+            <w:proofErr w:type="gramEnd"/>
             <w:r>
               <w:rPr>
                 <w:sz w:val="10"/>
@@ -1991,7 +2121,7 @@
         </w:trPr>
         <w:tc>
           <w:tcPr>
-            <w:tcW w:w="2267" w:type="dxa"/>
+            <w:tcW w:w="2405" w:type="dxa"/>
           </w:tcPr>
           <w:p>
             <w:pPr>
@@ -2004,12 +2134,13 @@
         </w:tc>
         <w:tc>
           <w:tcPr>
-            <w:tcW w:w="2267" w:type="dxa"/>
+            <w:tcW w:w="2129" w:type="dxa"/>
           </w:tcPr>
           <w:p>
             <w:pPr>
               <w:pStyle w:val="tabletext"/>
             </w:pPr>
+            <w:proofErr w:type="gramStart"/>
             <w:r>
               <w:t>{{</w:t>
             </w:r>
@@ -2024,6 +2155,7 @@
               <w:t>cif</w:t>
             </w:r>
             <w:proofErr w:type="spellEnd"/>
+            <w:proofErr w:type="gramEnd"/>
             <w:r>
               <w:rPr>
                 <w:sz w:val="10"/>
@@ -2056,7 +2188,7 @@
         </w:trPr>
         <w:tc>
           <w:tcPr>
-            <w:tcW w:w="2267" w:type="dxa"/>
+            <w:tcW w:w="2405" w:type="dxa"/>
           </w:tcPr>
           <w:p>
             <w:pPr>
@@ -2069,12 +2201,13 @@
         </w:tc>
         <w:tc>
           <w:tcPr>
-            <w:tcW w:w="2267" w:type="dxa"/>
+            <w:tcW w:w="2129" w:type="dxa"/>
           </w:tcPr>
           <w:p>
             <w:pPr>
               <w:pStyle w:val="tabletext"/>
             </w:pPr>
+            <w:proofErr w:type="gramStart"/>
             <w:r>
               <w:t xml:space="preserve">{{ </w:t>
             </w:r>
@@ -2086,6 +2219,7 @@
               <w:t>cif</w:t>
             </w:r>
             <w:proofErr w:type="spellEnd"/>
+            <w:proofErr w:type="gramEnd"/>
             <w:r>
               <w:rPr>
                 <w:sz w:val="10"/>
@@ -2118,7 +2252,7 @@
         </w:trPr>
         <w:tc>
           <w:tcPr>
-            <w:tcW w:w="2267" w:type="dxa"/>
+            <w:tcW w:w="2405" w:type="dxa"/>
           </w:tcPr>
           <w:p>
             <w:pPr>
@@ -2131,7 +2265,7 @@
         </w:tc>
         <w:tc>
           <w:tcPr>
-            <w:tcW w:w="2267" w:type="dxa"/>
+            <w:tcW w:w="2129" w:type="dxa"/>
           </w:tcPr>
           <w:p>
             <w:pPr>
@@ -2160,6 +2294,7 @@
             <w:r>
               <w:t xml:space="preserve"> </w:t>
             </w:r>
+            <w:proofErr w:type="gramStart"/>
             <w:r>
               <w:t>{{</w:t>
             </w:r>
@@ -2175,6 +2310,7 @@
               <w:t>itnum</w:t>
             </w:r>
             <w:proofErr w:type="spellEnd"/>
+            <w:proofErr w:type="gramEnd"/>
             <w:r>
               <w:rPr>
                 <w:sz w:val="16"/>
@@ -2194,12 +2330,13 @@
         </w:trPr>
         <w:tc>
           <w:tcPr>
-            <w:tcW w:w="2267" w:type="dxa"/>
+            <w:tcW w:w="2405" w:type="dxa"/>
           </w:tcPr>
           <w:p>
             <w:pPr>
               <w:pStyle w:val="tabletext"/>
             </w:pPr>
+            <w:proofErr w:type="gramStart"/>
             <w:r>
               <w:rPr>
                 <w:i/>
@@ -2213,6 +2350,7 @@
               <w:t>{{</w:t>
             </w:r>
             <w:proofErr w:type="spellStart"/>
+            <w:proofErr w:type="gramEnd"/>
             <w:r>
               <w:t>dist_unit</w:t>
             </w:r>
@@ -2227,12 +2365,13 @@
         </w:tc>
         <w:tc>
           <w:tcPr>
-            <w:tcW w:w="2267" w:type="dxa"/>
+            <w:tcW w:w="2129" w:type="dxa"/>
           </w:tcPr>
           <w:p>
             <w:pPr>
               <w:pStyle w:val="tabletext"/>
             </w:pPr>
+            <w:proofErr w:type="gramStart"/>
             <w:r>
               <w:t>{{</w:t>
             </w:r>
@@ -2247,6 +2386,7 @@
               <w:t>cif</w:t>
             </w:r>
             <w:proofErr w:type="spellEnd"/>
+            <w:proofErr w:type="gramEnd"/>
             <w:r>
               <w:rPr>
                 <w:sz w:val="12"/>
@@ -2285,12 +2425,13 @@
         </w:trPr>
         <w:tc>
           <w:tcPr>
-            <w:tcW w:w="2267" w:type="dxa"/>
+            <w:tcW w:w="2405" w:type="dxa"/>
           </w:tcPr>
           <w:p>
             <w:pPr>
               <w:pStyle w:val="tabletext"/>
             </w:pPr>
+            <w:proofErr w:type="gramStart"/>
             <w:r>
               <w:rPr>
                 <w:i/>
@@ -2304,6 +2445,7 @@
               <w:t>{{</w:t>
             </w:r>
             <w:proofErr w:type="spellStart"/>
+            <w:proofErr w:type="gramEnd"/>
             <w:r>
               <w:t>dist_unit</w:t>
             </w:r>
@@ -2318,12 +2460,13 @@
         </w:tc>
         <w:tc>
           <w:tcPr>
-            <w:tcW w:w="2267" w:type="dxa"/>
+            <w:tcW w:w="2129" w:type="dxa"/>
           </w:tcPr>
           <w:p>
             <w:pPr>
               <w:pStyle w:val="tabletext"/>
             </w:pPr>
+            <w:proofErr w:type="gramStart"/>
             <w:r>
               <w:t>{{</w:t>
             </w:r>
@@ -2338,6 +2481,7 @@
               <w:t>cif</w:t>
             </w:r>
             <w:proofErr w:type="spellEnd"/>
+            <w:proofErr w:type="gramEnd"/>
             <w:r>
               <w:rPr>
                 <w:sz w:val="12"/>
@@ -2349,13 +2493,27 @@
               <w:rPr>
                 <w:sz w:val="12"/>
               </w:rPr>
-              <w:t>cell_length_b</w:t>
-            </w:r>
+              <w:t>cell_length</w:t>
+            </w:r>
+            <w:proofErr w:type="gramStart"/>
             <w:r>
               <w:rPr>
                 <w:sz w:val="12"/>
               </w:rPr>
-              <w:t>|to_pm</w:t>
+              <w:t>_b</w:t>
+            </w:r>
+            <w:r>
+              <w:rPr>
+                <w:sz w:val="12"/>
+              </w:rPr>
+              <w:t>|</w:t>
+            </w:r>
+            <w:proofErr w:type="gramEnd"/>
+            <w:r>
+              <w:rPr>
+                <w:sz w:val="12"/>
+              </w:rPr>
+              <w:t>to_pm</w:t>
             </w:r>
             <w:proofErr w:type="spellEnd"/>
             <w:r>
@@ -2376,12 +2534,13 @@
         </w:trPr>
         <w:tc>
           <w:tcPr>
-            <w:tcW w:w="2267" w:type="dxa"/>
+            <w:tcW w:w="2405" w:type="dxa"/>
           </w:tcPr>
           <w:p>
             <w:pPr>
               <w:pStyle w:val="tabletext"/>
             </w:pPr>
+            <w:proofErr w:type="gramStart"/>
             <w:r>
               <w:rPr>
                 <w:i/>
@@ -2395,6 +2554,7 @@
               <w:t>{{</w:t>
             </w:r>
             <w:proofErr w:type="spellStart"/>
+            <w:proofErr w:type="gramEnd"/>
             <w:r>
               <w:t>dist_unit</w:t>
             </w:r>
@@ -2409,12 +2569,13 @@
         </w:tc>
         <w:tc>
           <w:tcPr>
-            <w:tcW w:w="2267" w:type="dxa"/>
+            <w:tcW w:w="2129" w:type="dxa"/>
           </w:tcPr>
           <w:p>
             <w:pPr>
               <w:pStyle w:val="tabletext"/>
             </w:pPr>
+            <w:proofErr w:type="gramStart"/>
             <w:r>
               <w:t>{{</w:t>
             </w:r>
@@ -2429,6 +2590,7 @@
               <w:t>cif</w:t>
             </w:r>
             <w:proofErr w:type="spellEnd"/>
+            <w:proofErr w:type="gramEnd"/>
             <w:r>
               <w:rPr>
                 <w:sz w:val="12"/>
@@ -2473,7 +2635,7 @@
         </w:trPr>
         <w:tc>
           <w:tcPr>
-            <w:tcW w:w="2267" w:type="dxa"/>
+            <w:tcW w:w="2405" w:type="dxa"/>
           </w:tcPr>
           <w:p>
             <w:pPr>
@@ -2492,12 +2654,13 @@
         </w:tc>
         <w:tc>
           <w:tcPr>
-            <w:tcW w:w="2267" w:type="dxa"/>
+            <w:tcW w:w="2129" w:type="dxa"/>
           </w:tcPr>
           <w:p>
             <w:pPr>
               <w:pStyle w:val="tabletext"/>
             </w:pPr>
+            <w:proofErr w:type="gramStart"/>
             <w:r>
               <w:t>{{</w:t>
             </w:r>
@@ -2512,6 +2675,7 @@
               <w:t>cif</w:t>
             </w:r>
             <w:proofErr w:type="spellEnd"/>
+            <w:proofErr w:type="gramEnd"/>
             <w:r>
               <w:rPr>
                 <w:sz w:val="12"/>
@@ -2556,7 +2720,7 @@
         </w:trPr>
         <w:tc>
           <w:tcPr>
-            <w:tcW w:w="2267" w:type="dxa"/>
+            <w:tcW w:w="2405" w:type="dxa"/>
           </w:tcPr>
           <w:p>
             <w:pPr>
@@ -2575,12 +2739,13 @@
         </w:tc>
         <w:tc>
           <w:tcPr>
-            <w:tcW w:w="2267" w:type="dxa"/>
+            <w:tcW w:w="2129" w:type="dxa"/>
           </w:tcPr>
           <w:p>
             <w:pPr>
               <w:pStyle w:val="tabletext"/>
             </w:pPr>
+            <w:proofErr w:type="gramStart"/>
             <w:r>
               <w:t>{{</w:t>
             </w:r>
@@ -2595,6 +2760,7 @@
               <w:t>cif</w:t>
             </w:r>
             <w:proofErr w:type="spellEnd"/>
+            <w:proofErr w:type="gramEnd"/>
             <w:r>
               <w:rPr>
                 <w:sz w:val="12"/>
@@ -2639,7 +2805,7 @@
         </w:trPr>
         <w:tc>
           <w:tcPr>
-            <w:tcW w:w="2267" w:type="dxa"/>
+            <w:tcW w:w="2405" w:type="dxa"/>
           </w:tcPr>
           <w:p>
             <w:pPr>
@@ -2658,12 +2824,13 @@
         </w:tc>
         <w:tc>
           <w:tcPr>
-            <w:tcW w:w="2267" w:type="dxa"/>
+            <w:tcW w:w="2129" w:type="dxa"/>
           </w:tcPr>
           <w:p>
             <w:pPr>
               <w:pStyle w:val="tabletext"/>
             </w:pPr>
+            <w:proofErr w:type="gramStart"/>
             <w:r>
               <w:t>{{</w:t>
             </w:r>
@@ -2678,6 +2845,7 @@
               <w:t>cif</w:t>
             </w:r>
             <w:proofErr w:type="spellEnd"/>
+            <w:proofErr w:type="gramEnd"/>
             <w:r>
               <w:rPr>
                 <w:sz w:val="12"/>
@@ -2722,7 +2890,7 @@
         </w:trPr>
         <w:tc>
           <w:tcPr>
-            <w:tcW w:w="2267" w:type="dxa"/>
+            <w:tcW w:w="2405" w:type="dxa"/>
           </w:tcPr>
           <w:p>
             <w:pPr>
@@ -2758,12 +2926,13 @@
         </w:tc>
         <w:tc>
           <w:tcPr>
-            <w:tcW w:w="2267" w:type="dxa"/>
+            <w:tcW w:w="2129" w:type="dxa"/>
           </w:tcPr>
           <w:p>
             <w:pPr>
               <w:pStyle w:val="tabletext"/>
             </w:pPr>
+            <w:proofErr w:type="gramStart"/>
             <w:r>
               <w:t>{{</w:t>
             </w:r>
@@ -2778,6 +2947,7 @@
               <w:t>cif</w:t>
             </w:r>
             <w:proofErr w:type="spellEnd"/>
+            <w:proofErr w:type="gramEnd"/>
             <w:r>
               <w:rPr>
                 <w:sz w:val="12"/>
@@ -2816,7 +2986,7 @@
         </w:trPr>
         <w:tc>
           <w:tcPr>
-            <w:tcW w:w="2267" w:type="dxa"/>
+            <w:tcW w:w="2405" w:type="dxa"/>
           </w:tcPr>
           <w:p>
             <w:pPr>
@@ -2832,12 +3002,13 @@
         </w:tc>
         <w:tc>
           <w:tcPr>
-            <w:tcW w:w="2267" w:type="dxa"/>
+            <w:tcW w:w="2129" w:type="dxa"/>
           </w:tcPr>
           <w:p>
             <w:pPr>
               <w:pStyle w:val="tabletext"/>
             </w:pPr>
+            <w:proofErr w:type="gramStart"/>
             <w:r>
               <w:t>{{</w:t>
             </w:r>
@@ -2852,6 +3023,7 @@
               <w:t>cif</w:t>
             </w:r>
             <w:proofErr w:type="spellEnd"/>
+            <w:proofErr w:type="gramEnd"/>
             <w:r>
               <w:rPr>
                 <w:sz w:val="12"/>
@@ -2884,7 +3056,7 @@
         </w:trPr>
         <w:tc>
           <w:tcPr>
-            <w:tcW w:w="2267" w:type="dxa"/>
+            <w:tcW w:w="2405" w:type="dxa"/>
           </w:tcPr>
           <w:p>
             <w:pPr>
@@ -2927,12 +3099,13 @@
         </w:tc>
         <w:tc>
           <w:tcPr>
-            <w:tcW w:w="2267" w:type="dxa"/>
+            <w:tcW w:w="2129" w:type="dxa"/>
           </w:tcPr>
           <w:p>
             <w:pPr>
               <w:pStyle w:val="tabletext"/>
             </w:pPr>
+            <w:proofErr w:type="gramStart"/>
             <w:r>
               <w:t>{{</w:t>
             </w:r>
@@ -2947,6 +3120,7 @@
               <w:t>cif</w:t>
             </w:r>
             <w:proofErr w:type="spellEnd"/>
+            <w:proofErr w:type="gramEnd"/>
             <w:r>
               <w:rPr>
                 <w:sz w:val="12"/>
@@ -2979,7 +3153,7 @@
         </w:trPr>
         <w:tc>
           <w:tcPr>
-            <w:tcW w:w="2267" w:type="dxa"/>
+            <w:tcW w:w="2405" w:type="dxa"/>
           </w:tcPr>
           <w:p>
             <w:pPr>
@@ -3014,12 +3188,13 @@
         </w:tc>
         <w:tc>
           <w:tcPr>
-            <w:tcW w:w="2267" w:type="dxa"/>
+            <w:tcW w:w="2129" w:type="dxa"/>
           </w:tcPr>
           <w:p>
             <w:pPr>
               <w:pStyle w:val="tabletext"/>
             </w:pPr>
+            <w:proofErr w:type="gramStart"/>
             <w:r>
               <w:t>{{</w:t>
             </w:r>
@@ -3029,28 +3204,33 @@
             <w:proofErr w:type="spellStart"/>
             <w:r>
               <w:rPr>
-                <w:sz w:val="12"/>
+                <w:sz w:val="10"/>
+                <w:szCs w:val="22"/>
               </w:rPr>
               <w:t>cif</w:t>
             </w:r>
             <w:proofErr w:type="spellEnd"/>
-            <w:r>
-              <w:rPr>
-                <w:sz w:val="12"/>
+            <w:proofErr w:type="gramEnd"/>
+            <w:r>
+              <w:rPr>
+                <w:sz w:val="10"/>
+                <w:szCs w:val="22"/>
               </w:rPr>
               <w:t>._</w:t>
             </w:r>
             <w:proofErr w:type="spellStart"/>
             <w:r>
               <w:rPr>
-                <w:sz w:val="12"/>
+                <w:sz w:val="10"/>
+                <w:szCs w:val="22"/>
               </w:rPr>
               <w:t>exptl_absorpt_coefficient_mu</w:t>
             </w:r>
             <w:proofErr w:type="spellEnd"/>
             <w:r>
               <w:rPr>
-                <w:sz w:val="12"/>
+                <w:sz w:val="10"/>
+                <w:szCs w:val="22"/>
               </w:rPr>
               <w:t xml:space="preserve"> </w:t>
             </w:r>
@@ -3066,12 +3246,13 @@
         </w:trPr>
         <w:tc>
           <w:tcPr>
-            <w:tcW w:w="2267" w:type="dxa"/>
+            <w:tcW w:w="2405" w:type="dxa"/>
           </w:tcPr>
           <w:p>
             <w:pPr>
               <w:pStyle w:val="tabletext"/>
             </w:pPr>
+            <w:proofErr w:type="gramStart"/>
             <w:r>
               <w:rPr>
                 <w:i/>
@@ -3079,18 +3260,23 @@
               <w:t>F</w:t>
             </w:r>
             <w:r>
-              <w:t>(000)</w:t>
-            </w:r>
-          </w:p>
-        </w:tc>
-        <w:tc>
-          <w:tcPr>
-            <w:tcW w:w="2267" w:type="dxa"/>
+              <w:t>(</w:t>
+            </w:r>
+            <w:proofErr w:type="gramEnd"/>
+            <w:r>
+              <w:t>000)</w:t>
+            </w:r>
+          </w:p>
+        </w:tc>
+        <w:tc>
+          <w:tcPr>
+            <w:tcW w:w="2129" w:type="dxa"/>
           </w:tcPr>
           <w:p>
             <w:pPr>
               <w:pStyle w:val="tabletext"/>
             </w:pPr>
+            <w:proofErr w:type="gramStart"/>
             <w:r>
               <w:t>{{</w:t>
             </w:r>
@@ -3101,7 +3287,14 @@
               <w:rPr>
                 <w:sz w:val="12"/>
               </w:rPr>
-              <w:t>cif._exptl_crystal_F_000</w:t>
+              <w:t>cif</w:t>
+            </w:r>
+            <w:proofErr w:type="gramEnd"/>
+            <w:r>
+              <w:rPr>
+                <w:sz w:val="12"/>
+              </w:rPr>
+              <w:t>._exptl_crystal_F_000</w:t>
             </w:r>
             <w:r>
               <w:rPr>
@@ -3121,7 +3314,7 @@
         </w:trPr>
         <w:tc>
           <w:tcPr>
-            <w:tcW w:w="2267" w:type="dxa"/>
+            <w:tcW w:w="2405" w:type="dxa"/>
           </w:tcPr>
           <w:p>
             <w:pPr>
@@ -3143,12 +3336,13 @@
         </w:tc>
         <w:tc>
           <w:tcPr>
-            <w:tcW w:w="2267" w:type="dxa"/>
+            <w:tcW w:w="2129" w:type="dxa"/>
           </w:tcPr>
           <w:p>
             <w:pPr>
               <w:pStyle w:val="tabletext"/>
             </w:pPr>
+            <w:proofErr w:type="gramStart"/>
             <w:r>
               <w:t>{{</w:t>
             </w:r>
@@ -3160,7 +3354,14 @@
               <w:rPr>
                 <w:sz w:val="14"/>
               </w:rPr>
-              <w:t>crystal_size</w:t>
+              <w:t>crystal</w:t>
+            </w:r>
+            <w:proofErr w:type="gramEnd"/>
+            <w:r>
+              <w:rPr>
+                <w:sz w:val="14"/>
+              </w:rPr>
+              <w:t>_size</w:t>
             </w:r>
             <w:proofErr w:type="spellEnd"/>
             <w:r>
@@ -3181,7 +3382,7 @@
         </w:trPr>
         <w:tc>
           <w:tcPr>
-            <w:tcW w:w="2267" w:type="dxa"/>
+            <w:tcW w:w="2405" w:type="dxa"/>
           </w:tcPr>
           <w:p>
             <w:pPr>
@@ -3199,12 +3400,13 @@
         </w:tc>
         <w:tc>
           <w:tcPr>
-            <w:tcW w:w="2267" w:type="dxa"/>
+            <w:tcW w:w="2129" w:type="dxa"/>
           </w:tcPr>
           <w:p>
             <w:pPr>
               <w:pStyle w:val="tabletext"/>
             </w:pPr>
+            <w:proofErr w:type="gramStart"/>
             <w:r>
               <w:t>{{</w:t>
             </w:r>
@@ -3216,7 +3418,14 @@
               <w:rPr>
                 <w:sz w:val="14"/>
               </w:rPr>
-              <w:t>crystal_colo</w:t>
+              <w:t>crystal</w:t>
+            </w:r>
+            <w:proofErr w:type="gramEnd"/>
+            <w:r>
+              <w:rPr>
+                <w:sz w:val="14"/>
+              </w:rPr>
+              <w:t>_colo</w:t>
             </w:r>
             <w:r>
               <w:rPr>
@@ -3249,7 +3458,7 @@
         </w:trPr>
         <w:tc>
           <w:tcPr>
-            <w:tcW w:w="2267" w:type="dxa"/>
+            <w:tcW w:w="2405" w:type="dxa"/>
           </w:tcPr>
           <w:p>
             <w:pPr>
@@ -3262,12 +3471,13 @@
         </w:tc>
         <w:tc>
           <w:tcPr>
-            <w:tcW w:w="2267" w:type="dxa"/>
+            <w:tcW w:w="2129" w:type="dxa"/>
           </w:tcPr>
           <w:p>
             <w:pPr>
               <w:pStyle w:val="tabletext"/>
             </w:pPr>
+            <w:proofErr w:type="gramStart"/>
             <w:r>
               <w:t>{{</w:t>
             </w:r>
@@ -3279,7 +3489,14 @@
               <w:rPr>
                 <w:sz w:val="14"/>
               </w:rPr>
-              <w:t>crystal_</w:t>
+              <w:t>crystal</w:t>
+            </w:r>
+            <w:proofErr w:type="gramEnd"/>
+            <w:r>
+              <w:rPr>
+                <w:sz w:val="14"/>
+              </w:rPr>
+              <w:t>_</w:t>
             </w:r>
             <w:r>
               <w:rPr>
@@ -3303,7 +3520,7 @@
         </w:trPr>
         <w:tc>
           <w:tcPr>
-            <w:tcW w:w="2267" w:type="dxa"/>
+            <w:tcW w:w="2405" w:type="dxa"/>
           </w:tcPr>
           <w:p>
             <w:pPr>
@@ -3316,12 +3533,13 @@
         </w:tc>
         <w:tc>
           <w:tcPr>
-            <w:tcW w:w="2267" w:type="dxa"/>
+            <w:tcW w:w="2129" w:type="dxa"/>
           </w:tcPr>
           <w:p>
             <w:pPr>
               <w:pStyle w:val="tabletext"/>
             </w:pPr>
+            <w:proofErr w:type="gramStart"/>
             <w:r>
               <w:t>{{</w:t>
             </w:r>
@@ -3334,12 +3552,14 @@
               </w:rPr>
               <w:t>radiation</w:t>
             </w:r>
+            <w:proofErr w:type="gramEnd"/>
             <w:r>
               <w:rPr>
                 <w:sz w:val="14"/>
               </w:rPr>
               <w:t xml:space="preserve"> </w:t>
             </w:r>
+            <w:proofErr w:type="gramStart"/>
             <w:r>
               <w:t>}}</w:t>
             </w:r>
@@ -3347,24 +3567,38 @@
               <w:rPr>
                 <w:sz w:val="12"/>
               </w:rPr>
-              <w:t>{%</w:t>
-            </w:r>
+              <w:t>{</w:t>
+            </w:r>
+            <w:proofErr w:type="gramEnd"/>
             <w:r>
               <w:rPr>
                 <w:sz w:val="12"/>
               </w:rPr>
+              <w:t>%</w:t>
+            </w:r>
+            <w:r>
+              <w:rPr>
+                <w:sz w:val="12"/>
+              </w:rPr>
               <w:t xml:space="preserve"> </w:t>
             </w:r>
             <w:r>
               <w:rPr>
                 <w:sz w:val="12"/>
               </w:rPr>
-              <w:t>if wavelength</w:t>
-            </w:r>
+              <w:t xml:space="preserve">if </w:t>
+            </w:r>
+            <w:proofErr w:type="gramStart"/>
             <w:r>
               <w:rPr>
                 <w:sz w:val="12"/>
               </w:rPr>
+              <w:t>wavelength</w:t>
+            </w:r>
+            <w:r>
+              <w:rPr>
+                <w:sz w:val="12"/>
+              </w:rPr>
               <w:t xml:space="preserve"> </w:t>
             </w:r>
             <w:r>
@@ -3373,8 +3607,13 @@
               </w:rPr>
               <w:t>%}</w:t>
             </w:r>
-            <w:r>
-              <w:t xml:space="preserve"> (λ=</w:t>
+            <w:proofErr w:type="gramEnd"/>
+            <w:r>
+              <w:t xml:space="preserve"> (λ</w:t>
+            </w:r>
+            <w:proofErr w:type="gramStart"/>
+            <w:r>
+              <w:t>=</w:t>
             </w:r>
             <w:r>
               <w:t>{{</w:t>
@@ -3388,6 +3627,7 @@
               </w:rPr>
               <w:t>wavelength</w:t>
             </w:r>
+            <w:proofErr w:type="gramEnd"/>
             <w:r>
               <w:rPr>
                 <w:sz w:val="12"/>
@@ -3418,7 +3658,14 @@
               <w:rPr>
                 <w:rFonts w:cstheme="minorHAnsi"/>
               </w:rPr>
-              <w:t>}}</w:t>
+              <w:t>}</w:t>
+            </w:r>
+            <w:proofErr w:type="gramStart"/>
+            <w:r>
+              <w:rPr>
+                <w:rFonts w:cstheme="minorHAnsi"/>
+              </w:rPr>
+              <w:t>}</w:t>
             </w:r>
             <w:r>
               <w:t>)</w:t>
@@ -3427,7 +3674,14 @@
               <w:rPr>
                 <w:sz w:val="14"/>
               </w:rPr>
-              <w:t>{%</w:t>
+              <w:t>{</w:t>
+            </w:r>
+            <w:proofErr w:type="gramEnd"/>
+            <w:r>
+              <w:rPr>
+                <w:sz w:val="14"/>
+              </w:rPr>
+              <w:t>%</w:t>
             </w:r>
             <w:r>
               <w:rPr>
@@ -3462,7 +3716,7 @@
         </w:trPr>
         <w:tc>
           <w:tcPr>
-            <w:tcW w:w="2267" w:type="dxa"/>
+            <w:tcW w:w="2405" w:type="dxa"/>
           </w:tcPr>
           <w:p>
             <w:pPr>
@@ -3481,12 +3735,13 @@
         </w:tc>
         <w:tc>
           <w:tcPr>
-            <w:tcW w:w="2267" w:type="dxa"/>
+            <w:tcW w:w="2129" w:type="dxa"/>
           </w:tcPr>
           <w:p>
             <w:pPr>
               <w:pStyle w:val="tabletext"/>
             </w:pPr>
+            <w:proofErr w:type="gramStart"/>
             <w:r>
               <w:t>{{</w:t>
             </w:r>
@@ -3498,7 +3753,14 @@
               <w:rPr>
                 <w:sz w:val="14"/>
               </w:rPr>
-              <w:t>theta_range</w:t>
+              <w:t>theta</w:t>
+            </w:r>
+            <w:proofErr w:type="gramEnd"/>
+            <w:r>
+              <w:rPr>
+                <w:sz w:val="14"/>
+              </w:rPr>
+              <w:t>_range</w:t>
             </w:r>
             <w:proofErr w:type="spellEnd"/>
             <w:r>
@@ -3519,7 +3781,7 @@
         </w:trPr>
         <w:tc>
           <w:tcPr>
-            <w:tcW w:w="2267" w:type="dxa"/>
+            <w:tcW w:w="2405" w:type="dxa"/>
           </w:tcPr>
           <w:p>
             <w:pPr>
@@ -3532,12 +3794,13 @@
         </w:tc>
         <w:tc>
           <w:tcPr>
-            <w:tcW w:w="2267" w:type="dxa"/>
+            <w:tcW w:w="2129" w:type="dxa"/>
           </w:tcPr>
           <w:p>
             <w:pPr>
               <w:pStyle w:val="tabletext"/>
             </w:pPr>
+            <w:proofErr w:type="gramStart"/>
             <w:r>
               <w:t>{{</w:t>
             </w:r>
@@ -3549,7 +3812,14 @@
               <w:rPr>
                 <w:sz w:val="14"/>
               </w:rPr>
-              <w:t>index_ranges</w:t>
+              <w:t>index</w:t>
+            </w:r>
+            <w:proofErr w:type="gramEnd"/>
+            <w:r>
+              <w:rPr>
+                <w:sz w:val="14"/>
+              </w:rPr>
+              <w:t>_ranges</w:t>
             </w:r>
             <w:proofErr w:type="spellEnd"/>
             <w:r>
@@ -3570,7 +3840,7 @@
         </w:trPr>
         <w:tc>
           <w:tcPr>
-            <w:tcW w:w="2267" w:type="dxa"/>
+            <w:tcW w:w="2405" w:type="dxa"/>
           </w:tcPr>
           <w:p>
             <w:pPr>
@@ -3583,12 +3853,13 @@
         </w:tc>
         <w:tc>
           <w:tcPr>
-            <w:tcW w:w="2267" w:type="dxa"/>
+            <w:tcW w:w="2129" w:type="dxa"/>
           </w:tcPr>
           <w:p>
             <w:pPr>
               <w:pStyle w:val="tabletext"/>
             </w:pPr>
+            <w:proofErr w:type="gramStart"/>
             <w:r>
               <w:t>{{</w:t>
             </w:r>
@@ -3603,6 +3874,7 @@
               <w:t>cif</w:t>
             </w:r>
             <w:proofErr w:type="spellEnd"/>
+            <w:proofErr w:type="gramEnd"/>
             <w:r>
               <w:rPr>
                 <w:sz w:val="14"/>
@@ -3635,7 +3907,7 @@
         </w:trPr>
         <w:tc>
           <w:tcPr>
-            <w:tcW w:w="2267" w:type="dxa"/>
+            <w:tcW w:w="2405" w:type="dxa"/>
           </w:tcPr>
           <w:p>
             <w:pPr>
@@ -3648,12 +3920,13 @@
         </w:tc>
         <w:tc>
           <w:tcPr>
-            <w:tcW w:w="2267" w:type="dxa"/>
+            <w:tcW w:w="2129" w:type="dxa"/>
           </w:tcPr>
           <w:p>
             <w:pPr>
               <w:pStyle w:val="tabletext"/>
             </w:pPr>
+            <w:proofErr w:type="gramStart"/>
             <w:r>
               <w:t>{{</w:t>
             </w:r>
@@ -3665,7 +3938,21 @@
               <w:rPr>
                 <w:sz w:val="12"/>
               </w:rPr>
-              <w:t>indepentent_refl</w:t>
+              <w:t>indepentent</w:t>
+            </w:r>
+            <w:proofErr w:type="gramEnd"/>
+            <w:r>
+              <w:rPr>
+                <w:sz w:val="12"/>
+              </w:rPr>
+              <w:t>_</w:t>
+            </w:r>
+            <w:proofErr w:type="gramStart"/>
+            <w:r>
+              <w:rPr>
+                <w:sz w:val="12"/>
+              </w:rPr>
+              <w:t>refl</w:t>
             </w:r>
             <w:proofErr w:type="spellEnd"/>
             <w:r>
@@ -3675,7 +3962,11 @@
               <w:t xml:space="preserve"> </w:t>
             </w:r>
             <w:r>
-              <w:t>}}</w:t>
+              <w:t>}</w:t>
+            </w:r>
+            <w:proofErr w:type="gramEnd"/>
+            <w:r>
+              <w:t>}</w:t>
             </w:r>
           </w:p>
           <w:p>
@@ -3698,7 +3989,11 @@
             </w:r>
             <w:proofErr w:type="spellEnd"/>
             <w:r>
-              <w:t xml:space="preserve"> = {{</w:t>
+              <w:t xml:space="preserve"> = </w:t>
+            </w:r>
+            <w:proofErr w:type="gramStart"/>
+            <w:r>
+              <w:t>{{</w:t>
             </w:r>
             <w:r>
               <w:t xml:space="preserve"> </w:t>
@@ -3708,7 +4003,14 @@
               <w:rPr>
                 <w:sz w:val="14"/>
               </w:rPr>
-              <w:t>r_int</w:t>
+              <w:t>r</w:t>
+            </w:r>
+            <w:proofErr w:type="gramEnd"/>
+            <w:r>
+              <w:rPr>
+                <w:sz w:val="14"/>
+              </w:rPr>
+              <w:t>_int</w:t>
             </w:r>
             <w:proofErr w:type="spellEnd"/>
             <w:r>
@@ -3738,7 +4040,11 @@
             </w:r>
             <w:proofErr w:type="spellEnd"/>
             <w:r>
-              <w:t xml:space="preserve"> = {{</w:t>
+              <w:t xml:space="preserve"> = </w:t>
+            </w:r>
+            <w:proofErr w:type="gramStart"/>
+            <w:r>
+              <w:t>{{</w:t>
             </w:r>
             <w:r>
               <w:t xml:space="preserve"> </w:t>
@@ -3748,7 +4054,14 @@
               <w:rPr>
                 <w:sz w:val="14"/>
               </w:rPr>
-              <w:t>r_sigma</w:t>
+              <w:t>r</w:t>
+            </w:r>
+            <w:proofErr w:type="gramEnd"/>
+            <w:r>
+              <w:rPr>
+                <w:sz w:val="14"/>
+              </w:rPr>
+              <w:t>_sigma</w:t>
             </w:r>
             <w:proofErr w:type="spellEnd"/>
             <w:r>
@@ -3769,12 +4082,13 @@
         </w:trPr>
         <w:tc>
           <w:tcPr>
-            <w:tcW w:w="2267" w:type="dxa"/>
+            <w:tcW w:w="2405" w:type="dxa"/>
           </w:tcPr>
           <w:p>
             <w:pPr>
               <w:pStyle w:val="tabletext"/>
             </w:pPr>
+            <w:proofErr w:type="gramStart"/>
             <w:r>
               <w:t>Completeness</w:t>
             </w:r>
@@ -3782,129 +4096,208 @@
               <w:rPr>
                 <w:sz w:val="10"/>
               </w:rPr>
-              <w:t>{%</w:t>
-            </w:r>
+              <w:t>{</w:t>
+            </w:r>
+            <w:proofErr w:type="gramEnd"/>
             <w:r>
               <w:rPr>
                 <w:sz w:val="10"/>
               </w:rPr>
-              <w:t xml:space="preserve"> </w:t>
-            </w:r>
+              <w:t xml:space="preserve">% if </w:t>
+            </w:r>
+            <w:proofErr w:type="spellStart"/>
             <w:r>
               <w:rPr>
                 <w:sz w:val="10"/>
               </w:rPr>
-              <w:t xml:space="preserve">if </w:t>
+              <w:t>theta_full</w:t>
+            </w:r>
+            <w:proofErr w:type="spellEnd"/>
+            <w:r>
+              <w:rPr>
+                <w:sz w:val="10"/>
+              </w:rPr>
+              <w:t xml:space="preserve"> %}</w:t>
+            </w:r>
+            <w:r>
+              <w:t xml:space="preserve"> to </w:t>
+            </w:r>
+            <w:r>
+              <w:br/>
+            </w:r>
+            <w:r>
+              <w:rPr>
+                <w:lang w:val="de-DE"/>
+              </w:rPr>
+              <w:t>θ</w:t>
+            </w:r>
+            <w:r>
+              <w:t xml:space="preserve"> = {{</w:t>
             </w:r>
             <w:proofErr w:type="spellStart"/>
             <w:r>
               <w:rPr>
-                <w:sz w:val="10"/>
-              </w:rPr>
-              <w:t>theta_full</w:t>
+                <w:sz w:val="12"/>
+                <w:szCs w:val="22"/>
+              </w:rPr>
+              <w:t>theta_full|float_</w:t>
+            </w:r>
+            <w:proofErr w:type="gramStart"/>
+            <w:r>
+              <w:rPr>
+                <w:sz w:val="12"/>
+                <w:szCs w:val="22"/>
+              </w:rPr>
+              <w:t>num</w:t>
             </w:r>
             <w:proofErr w:type="spellEnd"/>
             <w:r>
               <w:rPr>
-                <w:sz w:val="10"/>
-              </w:rPr>
-              <w:t xml:space="preserve"> </w:t>
-            </w:r>
-            <w:r>
-              <w:rPr>
-                <w:sz w:val="10"/>
-              </w:rPr>
-              <w:t>%}</w:t>
-            </w:r>
-            <w:r>
-              <w:t xml:space="preserve"> to </w:t>
-            </w:r>
-            <w:r>
-              <w:br/>
-            </w:r>
-            <w:r>
-              <w:t>θ</w:t>
-            </w:r>
-            <w:r>
-              <w:t xml:space="preserve"> = </w:t>
-            </w:r>
-            <w:r>
-              <w:t>{{</w:t>
+                <w:sz w:val="12"/>
+                <w:szCs w:val="22"/>
+              </w:rPr>
+              <w:t>(</w:t>
+            </w:r>
+            <w:proofErr w:type="gramEnd"/>
+            <w:r>
+              <w:rPr>
+                <w:sz w:val="12"/>
+                <w:szCs w:val="22"/>
+              </w:rPr>
+              <w:t>2)</w:t>
+            </w:r>
+            <w:proofErr w:type="gramStart"/>
+            <w:r>
+              <w:t>}}°</w:t>
+            </w:r>
+            <w:proofErr w:type="gramEnd"/>
+            <w:r>
+              <w:t xml:space="preserve"> / {{</w:t>
             </w:r>
             <w:proofErr w:type="spellStart"/>
             <w:r>
               <w:rPr>
-                <w:sz w:val="14"/>
-              </w:rPr>
-              <w:t>theta_full</w:t>
+                <w:sz w:val="12"/>
+                <w:szCs w:val="22"/>
+              </w:rPr>
+              <w:t>theta_max|float_</w:t>
+            </w:r>
+            <w:proofErr w:type="gramStart"/>
+            <w:r>
+              <w:rPr>
+                <w:sz w:val="12"/>
+                <w:szCs w:val="22"/>
+              </w:rPr>
+              <w:t>num</w:t>
             </w:r>
             <w:proofErr w:type="spellEnd"/>
             <w:r>
-              <w:t>}}</w:t>
-            </w:r>
-            <w:r>
-              <w:t>°</w:t>
-            </w:r>
-            <w:r>
               <w:rPr>
                 <w:sz w:val="12"/>
-              </w:rPr>
-              <w:t>{%</w:t>
-            </w:r>
+                <w:szCs w:val="22"/>
+              </w:rPr>
+              <w:t>(</w:t>
+            </w:r>
+            <w:proofErr w:type="gramEnd"/>
             <w:r>
               <w:rPr>
                 <w:sz w:val="12"/>
-              </w:rPr>
-              <w:t xml:space="preserve"> </w:t>
-            </w:r>
+                <w:szCs w:val="22"/>
+              </w:rPr>
+              <w:t>2)</w:t>
+            </w:r>
+            <w:proofErr w:type="gramStart"/>
+            <w:r>
+              <w:t>}}°</w:t>
+            </w:r>
+            <w:proofErr w:type="gramEnd"/>
             <w:r>
               <w:rPr>
                 <w:sz w:val="12"/>
               </w:rPr>
-              <w:t>endif</w:t>
-            </w:r>
+              <w:t>{% endif %}</w:t>
+            </w:r>
+          </w:p>
+        </w:tc>
+        <w:tc>
+          <w:tcPr>
+            <w:tcW w:w="2129" w:type="dxa"/>
+          </w:tcPr>
+          <w:p>
+            <w:pPr>
+              <w:pStyle w:val="tabletext"/>
+            </w:pPr>
+            <w:proofErr w:type="gramStart"/>
+            <w:r>
+              <w:t xml:space="preserve">{{ </w:t>
+            </w:r>
+            <w:proofErr w:type="spellStart"/>
             <w:r>
               <w:rPr>
                 <w:sz w:val="12"/>
-              </w:rPr>
-              <w:t xml:space="preserve"> </w:t>
-            </w:r>
+                <w:szCs w:val="16"/>
+              </w:rPr>
+              <w:t>completeness</w:t>
+            </w:r>
+            <w:proofErr w:type="gramEnd"/>
             <w:r>
               <w:rPr>
                 <w:sz w:val="12"/>
-              </w:rPr>
-              <w:t>%}</w:t>
-            </w:r>
-          </w:p>
-        </w:tc>
-        <w:tc>
-          <w:tcPr>
-            <w:tcW w:w="2267" w:type="dxa"/>
-          </w:tcPr>
-          <w:p>
-            <w:pPr>
-              <w:pStyle w:val="tabletext"/>
-            </w:pPr>
-            <w:r>
-              <w:t>{{</w:t>
-            </w:r>
-            <w:r>
-              <w:t xml:space="preserve"> </w:t>
-            </w:r>
-            <w:r>
-              <w:rPr>
-                <w:sz w:val="14"/>
+                <w:szCs w:val="16"/>
+              </w:rPr>
+              <w:t>_theta_</w:t>
+            </w:r>
+            <w:proofErr w:type="gramStart"/>
+            <w:r>
+              <w:rPr>
+                <w:sz w:val="12"/>
+                <w:szCs w:val="16"/>
+              </w:rPr>
+              <w:t>full</w:t>
+            </w:r>
+            <w:proofErr w:type="spellEnd"/>
+            <w:r>
+              <w:t xml:space="preserve"> }</w:t>
+            </w:r>
+            <w:proofErr w:type="gramEnd"/>
+            <w:r>
+              <w:t xml:space="preserve">} / </w:t>
+            </w:r>
+            <w:proofErr w:type="gramStart"/>
+            <w:r>
+              <w:t xml:space="preserve">{{ </w:t>
+            </w:r>
+            <w:proofErr w:type="spellStart"/>
+            <w:r>
+              <w:rPr>
+                <w:sz w:val="12"/>
+                <w:szCs w:val="16"/>
               </w:rPr>
               <w:t>completeness</w:t>
             </w:r>
-            <w:r>
-              <w:rPr>
-                <w:sz w:val="14"/>
-              </w:rPr>
-              <w:t xml:space="preserve"> </w:t>
-            </w:r>
-            <w:r>
-              <w:t>}}</w:t>
+            <w:proofErr w:type="gramEnd"/>
+            <w:r>
+              <w:rPr>
+                <w:sz w:val="12"/>
+                <w:szCs w:val="16"/>
+              </w:rPr>
+              <w:t>_theta_</w:t>
+            </w:r>
+            <w:proofErr w:type="gramStart"/>
+            <w:r>
+              <w:rPr>
+                <w:sz w:val="12"/>
+                <w:szCs w:val="16"/>
+              </w:rPr>
+              <w:t>max</w:t>
+            </w:r>
+            <w:proofErr w:type="spellEnd"/>
+            <w:r>
+              <w:t xml:space="preserve"> }</w:t>
+            </w:r>
+            <w:proofErr w:type="gramEnd"/>
+            <w:r>
+              <w:t>}</w:t>
             </w:r>
             <w:r>
               <w:t xml:space="preserve"> %</w:t>
@@ -3918,7 +4311,7 @@
         </w:trPr>
         <w:tc>
           <w:tcPr>
-            <w:tcW w:w="2267" w:type="dxa"/>
+            <w:tcW w:w="2405" w:type="dxa"/>
           </w:tcPr>
           <w:p>
             <w:pPr>
@@ -3931,12 +4324,13 @@
         </w:tc>
         <w:tc>
           <w:tcPr>
-            <w:tcW w:w="2267" w:type="dxa"/>
+            <w:tcW w:w="2129" w:type="dxa"/>
           </w:tcPr>
           <w:p>
             <w:pPr>
               <w:pStyle w:val="tabletext"/>
             </w:pPr>
+            <w:proofErr w:type="gramStart"/>
             <w:r>
               <w:t>{{</w:t>
             </w:r>
@@ -3949,8 +4343,13 @@
               </w:rPr>
               <w:t>data</w:t>
             </w:r>
-            <w:r>
-              <w:t>}} / {{</w:t>
+            <w:proofErr w:type="gramEnd"/>
+            <w:r>
+              <w:t xml:space="preserve">}} / </w:t>
+            </w:r>
+            <w:proofErr w:type="gramStart"/>
+            <w:r>
+              <w:t>{{</w:t>
             </w:r>
             <w:r>
               <w:t xml:space="preserve"> </w:t>
@@ -3961,6 +4360,7 @@
               </w:rPr>
               <w:t>restraints</w:t>
             </w:r>
+            <w:proofErr w:type="gramEnd"/>
             <w:r>
               <w:rPr>
                 <w:sz w:val="14"/>
@@ -3968,7 +4368,11 @@
               <w:t xml:space="preserve"> </w:t>
             </w:r>
             <w:r>
-              <w:t>}} / {{</w:t>
+              <w:t xml:space="preserve">}} / </w:t>
+            </w:r>
+            <w:proofErr w:type="gramStart"/>
+            <w:r>
+              <w:t>{{</w:t>
             </w:r>
             <w:r>
               <w:t xml:space="preserve"> </w:t>
@@ -3979,6 +4383,7 @@
               </w:rPr>
               <w:t>parameters</w:t>
             </w:r>
+            <w:proofErr w:type="gramEnd"/>
             <w:r>
               <w:rPr>
                 <w:sz w:val="14"/>
@@ -3997,7 +4402,7 @@
         </w:trPr>
         <w:tc>
           <w:tcPr>
-            <w:tcW w:w="2267" w:type="dxa"/>
+            <w:tcW w:w="2405" w:type="dxa"/>
           </w:tcPr>
           <w:p>
             <w:pPr>
@@ -4038,13 +4443,20 @@
         </w:tc>
         <w:tc>
           <w:tcPr>
-            <w:tcW w:w="2267" w:type="dxa"/>
+            <w:tcW w:w="2129" w:type="dxa"/>
           </w:tcPr>
           <w:p>
             <w:pPr>
               <w:pStyle w:val="tabletext"/>
-            </w:pPr>
-            <w:r>
+              <w:rPr>
+                <w:lang w:val="de-DE"/>
+              </w:rPr>
+            </w:pPr>
+            <w:proofErr w:type="gramStart"/>
+            <w:r>
+              <w:rPr>
+                <w:lang w:val="de-DE"/>
+              </w:rPr>
               <w:t xml:space="preserve">{{ </w:t>
             </w:r>
             <w:proofErr w:type="spellStart"/>
@@ -4052,78 +4464,158 @@
               <w:rPr>
                 <w:sz w:val="15"/>
                 <w:szCs w:val="18"/>
-              </w:rPr>
-              <w:t>t_min</w:t>
-            </w:r>
-            <w:proofErr w:type="spellEnd"/>
+                <w:lang w:val="de-DE"/>
+              </w:rPr>
+              <w:t>t</w:t>
+            </w:r>
+            <w:proofErr w:type="gramEnd"/>
             <w:r>
               <w:rPr>
                 <w:sz w:val="15"/>
                 <w:szCs w:val="18"/>
-              </w:rPr>
-              <w:t xml:space="preserve"> </w:t>
-            </w:r>
-            <w:r>
-              <w:t xml:space="preserve">}} / {{ </w:t>
-            </w:r>
-            <w:proofErr w:type="spellStart"/>
+                <w:lang w:val="de-DE"/>
+              </w:rPr>
+              <w:t>_</w:t>
+            </w:r>
+            <w:proofErr w:type="gramStart"/>
             <w:r>
               <w:rPr>
                 <w:sz w:val="15"/>
                 <w:szCs w:val="18"/>
-              </w:rPr>
-              <w:t>t_m</w:t>
-            </w:r>
+                <w:lang w:val="de-DE"/>
+              </w:rPr>
+              <w:t>min</w:t>
+            </w:r>
+            <w:proofErr w:type="spellEnd"/>
             <w:r>
               <w:rPr>
                 <w:sz w:val="15"/>
                 <w:szCs w:val="18"/>
-              </w:rPr>
-              <w:t>ax</w:t>
-            </w:r>
-            <w:proofErr w:type="spellEnd"/>
+                <w:lang w:val="de-DE"/>
+              </w:rPr>
+              <w:t xml:space="preserve"> </w:t>
+            </w:r>
+            <w:r>
+              <w:rPr>
+                <w:lang w:val="de-DE"/>
+              </w:rPr>
+              <w:t>}</w:t>
+            </w:r>
+            <w:proofErr w:type="gramEnd"/>
+            <w:r>
+              <w:rPr>
+                <w:lang w:val="de-DE"/>
+              </w:rPr>
+              <w:t xml:space="preserve">} / </w:t>
+            </w:r>
+            <w:proofErr w:type="gramStart"/>
+            <w:r>
+              <w:rPr>
+                <w:lang w:val="de-DE"/>
+              </w:rPr>
+              <w:t xml:space="preserve">{{ </w:t>
+            </w:r>
+            <w:proofErr w:type="spellStart"/>
             <w:r>
               <w:rPr>
                 <w:sz w:val="15"/>
                 <w:szCs w:val="18"/>
-              </w:rPr>
-              <w:t xml:space="preserve"> </w:t>
-            </w:r>
-            <w:r>
-              <w:t>}}</w:t>
-            </w:r>
-          </w:p>
-          <w:p>
-            <w:pPr>
-              <w:pStyle w:val="BodyText1"/>
-            </w:pPr>
-            <w:r>
-              <w:t>({{</w:t>
-            </w:r>
+                <w:lang w:val="de-DE"/>
+              </w:rPr>
+              <w:t>t</w:t>
+            </w:r>
+            <w:proofErr w:type="gramEnd"/>
             <w:r>
               <w:rPr>
                 <w:sz w:val="15"/>
                 <w:szCs w:val="18"/>
-              </w:rPr>
-              <w:t xml:space="preserve"> </w:t>
-            </w:r>
-            <w:proofErr w:type="spellStart"/>
+                <w:lang w:val="de-DE"/>
+              </w:rPr>
+              <w:t>_</w:t>
+            </w:r>
+            <w:proofErr w:type="gramStart"/>
             <w:r>
               <w:rPr>
                 <w:sz w:val="15"/>
                 <w:szCs w:val="18"/>
-              </w:rPr>
-              <w:t>abstype</w:t>
+                <w:lang w:val="de-DE"/>
+              </w:rPr>
+              <w:t>max</w:t>
             </w:r>
             <w:proofErr w:type="spellEnd"/>
             <w:r>
               <w:rPr>
                 <w:sz w:val="15"/>
                 <w:szCs w:val="18"/>
+                <w:lang w:val="de-DE"/>
               </w:rPr>
               <w:t xml:space="preserve"> </w:t>
             </w:r>
             <w:r>
+              <w:rPr>
+                <w:lang w:val="de-DE"/>
+              </w:rPr>
+              <w:t>}</w:t>
+            </w:r>
+            <w:proofErr w:type="gramEnd"/>
+            <w:r>
+              <w:rPr>
+                <w:lang w:val="de-DE"/>
+              </w:rPr>
+              <w:t>}</w:t>
+            </w:r>
+          </w:p>
+          <w:p>
+            <w:pPr>
+              <w:pStyle w:val="BodyText1"/>
+              <w:rPr>
+                <w:lang w:val="de-DE"/>
+              </w:rPr>
+            </w:pPr>
+            <w:r>
+              <w:rPr>
+                <w:lang w:val="de-DE"/>
+              </w:rPr>
+              <w:t>(</w:t>
+            </w:r>
+            <w:proofErr w:type="gramStart"/>
+            <w:r>
+              <w:rPr>
+                <w:lang w:val="de-DE"/>
+              </w:rPr>
+              <w:t>{{</w:t>
+            </w:r>
+            <w:r>
+              <w:rPr>
+                <w:sz w:val="15"/>
+                <w:szCs w:val="18"/>
+                <w:lang w:val="de-DE"/>
+              </w:rPr>
+              <w:t xml:space="preserve"> </w:t>
+            </w:r>
+            <w:proofErr w:type="spellStart"/>
+            <w:r>
+              <w:rPr>
+                <w:sz w:val="15"/>
+                <w:szCs w:val="18"/>
+                <w:lang w:val="de-DE"/>
+              </w:rPr>
+              <w:t>abstype</w:t>
+            </w:r>
+            <w:proofErr w:type="spellEnd"/>
+            <w:proofErr w:type="gramEnd"/>
+            <w:r>
+              <w:rPr>
+                <w:sz w:val="15"/>
+                <w:szCs w:val="18"/>
+                <w:lang w:val="de-DE"/>
+              </w:rPr>
+              <w:t xml:space="preserve"> </w:t>
+            </w:r>
+            <w:r>
+              <w:rPr>
+                <w:lang w:val="de-DE"/>
+              </w:rPr>
               <w:t>}})</w:t>
             </w:r>
           </w:p>
@@ -4135,7 +4627,7 @@
         </w:trPr>
         <w:tc>
           <w:tcPr>
-            <w:tcW w:w="2267" w:type="dxa"/>
+            <w:tcW w:w="2405" w:type="dxa"/>
           </w:tcPr>
           <w:p>
             <w:pPr>
@@ -4160,14 +4652,19 @@
         </w:tc>
         <w:tc>
           <w:tcPr>
-            <w:tcW w:w="2267" w:type="dxa"/>
+            <w:tcW w:w="2129" w:type="dxa"/>
           </w:tcPr>
           <w:p>
             <w:pPr>
               <w:pStyle w:val="tabletext"/>
             </w:pPr>
-            <w:r>
-              <w:t>{{ goof }}</w:t>
+            <w:proofErr w:type="gramStart"/>
+            <w:r>
+              <w:t>{{ goof</w:t>
+            </w:r>
+            <w:proofErr w:type="gramEnd"/>
+            <w:r>
+              <w:t xml:space="preserve"> }}</w:t>
             </w:r>
           </w:p>
         </w:tc>
@@ -4178,7 +4675,7 @@
         </w:trPr>
         <w:tc>
           <w:tcPr>
-            <w:tcW w:w="2267" w:type="dxa"/>
+            <w:tcW w:w="2405" w:type="dxa"/>
           </w:tcPr>
           <w:p>
             <w:pPr>
@@ -4222,7 +4719,7 @@
         </w:tc>
         <w:tc>
           <w:tcPr>
-            <w:tcW w:w="2267" w:type="dxa"/>
+            <w:tcW w:w="2129" w:type="dxa"/>
           </w:tcPr>
           <w:p>
             <w:pPr>
@@ -4241,7 +4738,11 @@
               <w:t>1</w:t>
             </w:r>
             <w:r>
-              <w:t xml:space="preserve"> = {{</w:t>
+              <w:t xml:space="preserve"> = </w:t>
+            </w:r>
+            <w:proofErr w:type="gramStart"/>
+            <w:r>
+              <w:t>{{</w:t>
             </w:r>
             <w:r>
               <w:t xml:space="preserve"> </w:t>
@@ -4251,7 +4752,14 @@
               <w:rPr>
                 <w:sz w:val="14"/>
               </w:rPr>
-              <w:t>ls_R_factor_gt</w:t>
+              <w:t>ls</w:t>
+            </w:r>
+            <w:proofErr w:type="gramEnd"/>
+            <w:r>
+              <w:rPr>
+                <w:sz w:val="14"/>
+              </w:rPr>
+              <w:t>_R_factor_gt</w:t>
             </w:r>
             <w:proofErr w:type="spellEnd"/>
             <w:r>
@@ -4280,7 +4788,11 @@
               <w:t>2</w:t>
             </w:r>
             <w:r>
-              <w:t xml:space="preserve"> = {{</w:t>
+              <w:t xml:space="preserve"> = </w:t>
+            </w:r>
+            <w:proofErr w:type="gramStart"/>
+            <w:r>
+              <w:t>{{</w:t>
             </w:r>
             <w:r>
               <w:t xml:space="preserve"> </w:t>
@@ -4290,7 +4802,14 @@
               <w:rPr>
                 <w:sz w:val="14"/>
               </w:rPr>
-              <w:t>ls_wR_factor_gt</w:t>
+              <w:t>ls</w:t>
+            </w:r>
+            <w:proofErr w:type="gramEnd"/>
+            <w:r>
+              <w:rPr>
+                <w:sz w:val="14"/>
+              </w:rPr>
+              <w:t>_wR_factor_gt</w:t>
             </w:r>
             <w:proofErr w:type="spellEnd"/>
             <w:r>
@@ -4311,7 +4830,7 @@
         </w:trPr>
         <w:tc>
           <w:tcPr>
-            <w:tcW w:w="2267" w:type="dxa"/>
+            <w:tcW w:w="2405" w:type="dxa"/>
           </w:tcPr>
           <w:p>
             <w:pPr>
@@ -4337,7 +4856,7 @@
         </w:tc>
         <w:tc>
           <w:tcPr>
-            <w:tcW w:w="2267" w:type="dxa"/>
+            <w:tcW w:w="2129" w:type="dxa"/>
           </w:tcPr>
           <w:p>
             <w:pPr>
@@ -4356,7 +4875,11 @@
               <w:t>1</w:t>
             </w:r>
             <w:r>
-              <w:t xml:space="preserve"> = {{</w:t>
+              <w:t xml:space="preserve"> = </w:t>
+            </w:r>
+            <w:proofErr w:type="gramStart"/>
+            <w:r>
+              <w:t>{{</w:t>
             </w:r>
             <w:r>
               <w:t xml:space="preserve"> </w:t>
@@ -4366,7 +4889,14 @@
               <w:rPr>
                 <w:sz w:val="14"/>
               </w:rPr>
-              <w:t>ls_R_factor_all</w:t>
+              <w:t>ls</w:t>
+            </w:r>
+            <w:proofErr w:type="gramEnd"/>
+            <w:r>
+              <w:rPr>
+                <w:sz w:val="14"/>
+              </w:rPr>
+              <w:t>_R_factor_all</w:t>
             </w:r>
             <w:proofErr w:type="spellEnd"/>
             <w:r>
@@ -4395,7 +4925,11 @@
               <w:t>2</w:t>
             </w:r>
             <w:r>
-              <w:t xml:space="preserve"> = {{</w:t>
+              <w:t xml:space="preserve"> = </w:t>
+            </w:r>
+            <w:proofErr w:type="gramStart"/>
+            <w:r>
+              <w:t>{{</w:t>
             </w:r>
             <w:r>
               <w:t xml:space="preserve"> </w:t>
@@ -4406,7 +4940,15 @@
                 <w:sz w:val="14"/>
                 <w:szCs w:val="14"/>
               </w:rPr>
-              <w:t>ls_wR_factor_ref</w:t>
+              <w:t>ls</w:t>
+            </w:r>
+            <w:proofErr w:type="gramEnd"/>
+            <w:r>
+              <w:rPr>
+                <w:sz w:val="14"/>
+                <w:szCs w:val="14"/>
+              </w:rPr>
+              <w:t>_wR_factor_ref</w:t>
             </w:r>
             <w:proofErr w:type="spellEnd"/>
             <w:r>
@@ -4428,7 +4970,7 @@
         </w:trPr>
         <w:tc>
           <w:tcPr>
-            <w:tcW w:w="2267" w:type="dxa"/>
+            <w:tcW w:w="2405" w:type="dxa"/>
           </w:tcPr>
           <w:p>
             <w:pPr>
@@ -4457,7 +4999,7 @@
         </w:tc>
         <w:tc>
           <w:tcPr>
-            <w:tcW w:w="2267" w:type="dxa"/>
+            <w:tcW w:w="2129" w:type="dxa"/>
           </w:tcPr>
           <w:p>
             <w:pPr>
@@ -4466,6 +5008,7 @@
                 <w:lang w:val="de-DE"/>
               </w:rPr>
             </w:pPr>
+            <w:proofErr w:type="gramStart"/>
             <w:r>
               <w:rPr>
                 <w:lang w:val="de-DE"/>
@@ -4481,15 +5024,35 @@
             <w:proofErr w:type="spellStart"/>
             <w:r>
               <w:rPr>
-                <w:sz w:val="12"/>
+                <w:sz w:val="10"/>
+                <w:szCs w:val="22"/>
                 <w:lang w:val="de-DE"/>
               </w:rPr>
-              <w:t>diff_dens_max</w:t>
+              <w:t>diff</w:t>
+            </w:r>
+            <w:proofErr w:type="gramEnd"/>
+            <w:r>
+              <w:rPr>
+                <w:sz w:val="10"/>
+                <w:szCs w:val="22"/>
+                <w:lang w:val="de-DE"/>
+              </w:rPr>
+              <w:t>_dens_</w:t>
+            </w:r>
+            <w:proofErr w:type="gramStart"/>
+            <w:r>
+              <w:rPr>
+                <w:sz w:val="10"/>
+                <w:szCs w:val="22"/>
+                <w:lang w:val="de-DE"/>
+              </w:rPr>
+              <w:t>max</w:t>
             </w:r>
             <w:proofErr w:type="spellEnd"/>
             <w:r>
               <w:rPr>
-                <w:sz w:val="12"/>
+                <w:sz w:val="10"/>
+                <w:szCs w:val="22"/>
                 <w:lang w:val="de-DE"/>
               </w:rPr>
               <w:t xml:space="preserve"> </w:t>
@@ -4521,15 +5084,26 @@
             <w:proofErr w:type="spellStart"/>
             <w:r>
               <w:rPr>
-                <w:sz w:val="12"/>
+                <w:sz w:val="10"/>
+                <w:szCs w:val="22"/>
                 <w:lang w:val="de-DE"/>
               </w:rPr>
-              <w:t>diff_dens_min</w:t>
+              <w:t>diff</w:t>
+            </w:r>
+            <w:proofErr w:type="gramEnd"/>
+            <w:r>
+              <w:rPr>
+                <w:sz w:val="10"/>
+                <w:szCs w:val="22"/>
+                <w:lang w:val="de-DE"/>
+              </w:rPr>
+              <w:t>_dens_min</w:t>
             </w:r>
             <w:proofErr w:type="spellEnd"/>
             <w:r>
               <w:rPr>
-                <w:sz w:val="12"/>
+                <w:sz w:val="10"/>
+                <w:szCs w:val="22"/>
                 <w:lang w:val="de-DE"/>
               </w:rPr>
               <w:t xml:space="preserve"> </w:t>
@@ -4549,7 +5123,7 @@
         </w:trPr>
         <w:tc>
           <w:tcPr>
-            <w:tcW w:w="2267" w:type="dxa"/>
+            <w:tcW w:w="2405" w:type="dxa"/>
           </w:tcPr>
           <w:p>
             <w:pPr>
@@ -4585,7 +5159,7 @@
         </w:tc>
         <w:tc>
           <w:tcPr>
-            <w:tcW w:w="2267" w:type="dxa"/>
+            <w:tcW w:w="2129" w:type="dxa"/>
           </w:tcPr>
           <w:p>
             <w:pPr>
@@ -4600,7 +5174,7 @@
         </w:trPr>
         <w:tc>
           <w:tcPr>
-            <w:tcW w:w="2267" w:type="dxa"/>
+            <w:tcW w:w="2405" w:type="dxa"/>
           </w:tcPr>
           <w:p>
             <w:pPr>
@@ -4613,9 +5187,10 @@
         </w:tc>
         <w:tc>
           <w:tcPr>
-            <w:tcW w:w="2267" w:type="dxa"/>
-          </w:tcPr>
-          <w:p>
+            <w:tcW w:w="2129" w:type="dxa"/>
+          </w:tcPr>
+          <w:p>
+            <w:proofErr w:type="gramStart"/>
             <w:r>
               <w:t>{{</w:t>
             </w:r>
@@ -4631,6 +5206,7 @@
               <w:t>exti</w:t>
             </w:r>
             <w:proofErr w:type="spellEnd"/>
+            <w:proofErr w:type="gramEnd"/>
             <w:r>
               <w:rPr>
                 <w:sz w:val="16"/>
@@ -4650,7 +5226,7 @@
         </w:trPr>
         <w:tc>
           <w:tcPr>
-            <w:tcW w:w="2267" w:type="dxa"/>
+            <w:tcW w:w="2405" w:type="dxa"/>
           </w:tcPr>
           <w:p>
             <w:pPr>
@@ -4690,7 +5266,7 @@
         </w:tc>
         <w:tc>
           <w:tcPr>
-            <w:tcW w:w="2267" w:type="dxa"/>
+            <w:tcW w:w="2129" w:type="dxa"/>
           </w:tcPr>
           <w:p/>
         </w:tc>
@@ -4701,7 +5277,7 @@
         </w:trPr>
         <w:tc>
           <w:tcPr>
-            <w:tcW w:w="2267" w:type="dxa"/>
+            <w:tcW w:w="2405" w:type="dxa"/>
           </w:tcPr>
           <w:p>
             <w:pPr>
@@ -4749,7 +5325,7 @@
         </w:tc>
         <w:tc>
           <w:tcPr>
-            <w:tcW w:w="2267" w:type="dxa"/>
+            <w:tcW w:w="2129" w:type="dxa"/>
           </w:tcPr>
           <w:p/>
         </w:tc>
@@ -4760,7 +5336,7 @@
         </w:trPr>
         <w:tc>
           <w:tcPr>
-            <w:tcW w:w="2267" w:type="dxa"/>
+            <w:tcW w:w="2405" w:type="dxa"/>
           </w:tcPr>
           <w:p>
             <w:pPr>
@@ -4773,9 +5349,10 @@
         </w:tc>
         <w:tc>
           <w:tcPr>
-            <w:tcW w:w="2267" w:type="dxa"/>
-          </w:tcPr>
-          <w:p>
+            <w:tcW w:w="2129" w:type="dxa"/>
+          </w:tcPr>
+          <w:p>
+            <w:proofErr w:type="gramStart"/>
             <w:r>
               <w:t>{{</w:t>
             </w:r>
@@ -4788,7 +5365,15 @@
                 <w:sz w:val="16"/>
                 <w:szCs w:val="20"/>
               </w:rPr>
-              <w:t>flack_x</w:t>
+              <w:t>flack</w:t>
+            </w:r>
+            <w:proofErr w:type="gramEnd"/>
+            <w:r>
+              <w:rPr>
+                <w:sz w:val="16"/>
+                <w:szCs w:val="20"/>
+              </w:rPr>
+              <w:t>_x</w:t>
             </w:r>
             <w:proofErr w:type="spellEnd"/>
             <w:r>
@@ -4810,7 +5395,7 @@
         </w:trPr>
         <w:tc>
           <w:tcPr>
-            <w:tcW w:w="2267" w:type="dxa"/>
+            <w:tcW w:w="2405" w:type="dxa"/>
           </w:tcPr>
           <w:p>
             <w:pPr>
@@ -4832,7 +5417,7 @@
         </w:tc>
         <w:tc>
           <w:tcPr>
-            <w:tcW w:w="2267" w:type="dxa"/>
+            <w:tcW w:w="2129" w:type="dxa"/>
           </w:tcPr>
           <w:p/>
         </w:tc>
@@ -4849,7 +5434,6 @@
         </w:sectPr>
       </w:pPr>
       <w:r>
-        <w:lastRenderedPageBreak/>
         <w:br w:type="page"/>
       </w:r>
     </w:p>
@@ -4863,12 +5447,17 @@
       </w:r>
       <w:proofErr w:type="spellStart"/>
       <w:r>
-        <w:t>crystal_video</w:t>
+        <w:t>crystal_</w:t>
+      </w:r>
+      <w:proofErr w:type="gramStart"/>
+      <w:r>
+        <w:t>video</w:t>
       </w:r>
       <w:proofErr w:type="spellEnd"/>
       <w:r>
         <w:t xml:space="preserve"> %}</w:t>
       </w:r>
+      <w:proofErr w:type="gramEnd"/>
     </w:p>
     <w:p>
       <w:pPr>
@@ -4878,23 +5467,44 @@
         <w:t>Crystal habit of</w:t>
       </w:r>
       <w:r>
-        <w:t xml:space="preserve"> {{ cif.block.name }}</w:t>
+        <w:t xml:space="preserve"> </w:t>
+      </w:r>
+      <w:proofErr w:type="gramStart"/>
+      <w:r>
+        <w:t>{{ cif.block.name</w:t>
+      </w:r>
+      <w:proofErr w:type="gramEnd"/>
+      <w:r>
+        <w:t xml:space="preserve"> }}</w:t>
       </w:r>
     </w:p>
     <w:p>
       <w:pPr>
         <w:pStyle w:val="Figure"/>
       </w:pPr>
+      <w:proofErr w:type="gramStart"/>
       <w:r>
         <w:t xml:space="preserve">{{ </w:t>
       </w:r>
       <w:proofErr w:type="spellStart"/>
       <w:r>
-        <w:t>crystal_video</w:t>
+        <w:t>crystal</w:t>
+      </w:r>
+      <w:proofErr w:type="gramEnd"/>
+      <w:r>
+        <w:t>_</w:t>
+      </w:r>
+      <w:proofErr w:type="gramStart"/>
+      <w:r>
+        <w:t>video</w:t>
       </w:r>
       <w:proofErr w:type="spellEnd"/>
       <w:r>
-        <w:t xml:space="preserve"> }}</w:t>
+        <w:t xml:space="preserve"> }</w:t>
+      </w:r>
+      <w:proofErr w:type="gramEnd"/>
+      <w:r>
+        <w:t>}</w:t>
       </w:r>
     </w:p>
     <w:p>
@@ -4902,8 +5512,13 @@
         <w:pStyle w:val="Heading2"/>
       </w:pPr>
       <w:r>
-        <w:t>{%p endif %}</w:t>
-      </w:r>
+        <w:t xml:space="preserve">{%p </w:t>
+      </w:r>
+      <w:proofErr w:type="gramStart"/>
+      <w:r>
+        <w:t>endif %}</w:t>
+      </w:r>
+      <w:proofErr w:type="gramEnd"/>
     </w:p>
     <w:p>
       <w:pPr>
@@ -4937,7 +5552,16 @@
           <w:sz w:val="20"/>
           <w:szCs w:val="21"/>
         </w:rPr>
-        <w:t>refinement_details</w:t>
+        <w:t>refinement_</w:t>
+      </w:r>
+      <w:proofErr w:type="gramStart"/>
+      <w:r>
+        <w:rPr>
+          <w:color w:val="00B050"/>
+          <w:sz w:val="20"/>
+          <w:szCs w:val="21"/>
+        </w:rPr>
+        <w:t>details</w:t>
       </w:r>
       <w:proofErr w:type="spellEnd"/>
       <w:r>
@@ -4949,19 +5573,29 @@
       <w:r>
         <w:t>%}</w:t>
       </w:r>
+      <w:proofErr w:type="gramEnd"/>
     </w:p>
     <w:p>
       <w:pPr>
         <w:pStyle w:val="Heading2"/>
       </w:pPr>
       <w:r>
-        <w:t>Refinement details for {{ cif.block.name }}</w:t>
+        <w:t xml:space="preserve">Refinement details for </w:t>
+      </w:r>
+      <w:proofErr w:type="gramStart"/>
+      <w:r>
+        <w:t>{{ cif.block.name</w:t>
+      </w:r>
+      <w:proofErr w:type="gramEnd"/>
+      <w:r>
+        <w:t xml:space="preserve"> }}</w:t>
       </w:r>
     </w:p>
     <w:p>
       <w:pPr>
         <w:pStyle w:val="BodyText1"/>
       </w:pPr>
+      <w:proofErr w:type="gramStart"/>
       <w:r>
         <w:t>{</w:t>
       </w:r>
@@ -4973,7 +5607,15 @@
       </w:r>
       <w:proofErr w:type="spellStart"/>
       <w:r>
-        <w:t>refinement_details</w:t>
+        <w:t>refinement</w:t>
+      </w:r>
+      <w:proofErr w:type="gramEnd"/>
+      <w:r>
+        <w:t>_</w:t>
+      </w:r>
+      <w:proofErr w:type="gramStart"/>
+      <w:r>
+        <w:t>details</w:t>
       </w:r>
       <w:proofErr w:type="spellEnd"/>
       <w:r>
@@ -4982,6 +5624,7 @@
       <w:r>
         <w:t>}</w:t>
       </w:r>
+      <w:proofErr w:type="gramEnd"/>
       <w:r>
         <w:t>}</w:t>
       </w:r>
@@ -4999,6 +5642,7 @@
       <w:r>
         <w:t xml:space="preserve"> </w:t>
       </w:r>
+      <w:proofErr w:type="gramStart"/>
       <w:r>
         <w:rPr>
           <w:color w:val="00B050"/>
@@ -5010,6 +5654,7 @@
       <w:r>
         <w:t>%}</w:t>
       </w:r>
+      <w:proofErr w:type="gramEnd"/>
     </w:p>
     <w:p>
       <w:pPr>
@@ -5047,20 +5692,30 @@
           <w:sz w:val="20"/>
           <w:szCs w:val="21"/>
         </w:rPr>
-        <w:t>atomic_coordinates</w:t>
-      </w:r>
-      <w:proofErr w:type="spellEnd"/>
+        <w:t>atomic_</w:t>
+      </w:r>
+      <w:proofErr w:type="gramStart"/>
       <w:r>
         <w:rPr>
           <w:color w:val="00B050"/>
           <w:sz w:val="20"/>
           <w:szCs w:val="21"/>
         </w:rPr>
+        <w:t>coordinates</w:t>
+      </w:r>
+      <w:proofErr w:type="spellEnd"/>
+      <w:r>
+        <w:rPr>
+          <w:color w:val="00B050"/>
+          <w:sz w:val="20"/>
+          <w:szCs w:val="21"/>
+        </w:rPr>
         <w:t xml:space="preserve"> </w:t>
       </w:r>
       <w:r>
         <w:t>%}</w:t>
       </w:r>
+      <w:proofErr w:type="gramEnd"/>
     </w:p>
     <w:p>
       <w:pPr>
@@ -5139,7 +5794,15 @@
         <w:t>2</w:t>
       </w:r>
       <w:r>
-        <w:t>] for {{ cif.block.name }}</w:t>
+        <w:t xml:space="preserve">] for </w:t>
+      </w:r>
+      <w:proofErr w:type="gramStart"/>
+      <w:r>
+        <w:t>{{ cif.block.name</w:t>
+      </w:r>
+      <w:proofErr w:type="gramEnd"/>
+      <w:r>
+        <w:t xml:space="preserve"> }}</w:t>
       </w:r>
     </w:p>
     <w:tbl>
@@ -5353,6 +6016,7 @@
             <w:pPr>
               <w:pStyle w:val="BodyText1"/>
             </w:pPr>
+            <w:proofErr w:type="gramStart"/>
             <w:r>
               <w:t xml:space="preserve">{{ </w:t>
             </w:r>
@@ -5364,6 +6028,7 @@
               </w:rPr>
               <w:t>atom</w:t>
             </w:r>
+            <w:proofErr w:type="gramEnd"/>
             <w:r>
               <w:rPr>
                 <w:sz w:val="16"/>
@@ -5390,6 +6055,7 @@
             <w:pPr>
               <w:pStyle w:val="BodyText1"/>
             </w:pPr>
+            <w:proofErr w:type="gramStart"/>
             <w:r>
               <w:t xml:space="preserve">{{ </w:t>
             </w:r>
@@ -5400,6 +6066,7 @@
               </w:rPr>
               <w:t>atom</w:t>
             </w:r>
+            <w:proofErr w:type="gramEnd"/>
             <w:r>
               <w:t>.x</w:t>
             </w:r>
@@ -5417,6 +6084,7 @@
             <w:pPr>
               <w:pStyle w:val="BodyText1"/>
             </w:pPr>
+            <w:proofErr w:type="gramStart"/>
             <w:r>
               <w:t xml:space="preserve">{{ </w:t>
             </w:r>
@@ -5427,6 +6095,7 @@
               </w:rPr>
               <w:t>atom</w:t>
             </w:r>
+            <w:proofErr w:type="gramEnd"/>
             <w:r>
               <w:t>.y</w:t>
             </w:r>
@@ -5444,6 +6113,7 @@
             <w:pPr>
               <w:pStyle w:val="BodyText1"/>
             </w:pPr>
+            <w:proofErr w:type="gramStart"/>
             <w:r>
               <w:t xml:space="preserve">{{ </w:t>
             </w:r>
@@ -5454,6 +6124,7 @@
               </w:rPr>
               <w:t>atom</w:t>
             </w:r>
+            <w:proofErr w:type="gramEnd"/>
             <w:r>
               <w:t>.z</w:t>
             </w:r>
@@ -5471,6 +6142,7 @@
             <w:pPr>
               <w:pStyle w:val="BodyText1"/>
             </w:pPr>
+            <w:proofErr w:type="gramStart"/>
             <w:r>
               <w:t xml:space="preserve">{{ </w:t>
             </w:r>
@@ -5481,6 +6153,7 @@
               </w:rPr>
               <w:t>atom</w:t>
             </w:r>
+            <w:proofErr w:type="gramEnd"/>
             <w:r>
               <w:t>.u_eq</w:t>
             </w:r>
@@ -5625,6 +6298,7 @@
       <w:r>
         <w:t xml:space="preserve"> </w:t>
       </w:r>
+      <w:proofErr w:type="gramStart"/>
       <w:r>
         <w:rPr>
           <w:color w:val="00B050"/>
@@ -5634,6 +6308,7 @@
       <w:r>
         <w:t>%}</w:t>
       </w:r>
+      <w:proofErr w:type="gramEnd"/>
     </w:p>
     <w:p>
       <w:pPr>
@@ -5687,11 +6362,26 @@
         <w:t xml:space="preserve">and </w:t>
       </w:r>
       <w:proofErr w:type="spellStart"/>
+      <w:proofErr w:type="gramStart"/>
       <w:r>
         <w:rPr>
           <w:color w:val="00B050"/>
         </w:rPr>
-        <w:t>options.report_adp</w:t>
+        <w:t>options.report</w:t>
+      </w:r>
+      <w:proofErr w:type="gramEnd"/>
+      <w:r>
+        <w:rPr>
+          <w:color w:val="00B050"/>
+        </w:rPr>
+        <w:t>_</w:t>
+      </w:r>
+      <w:proofErr w:type="gramStart"/>
+      <w:r>
+        <w:rPr>
+          <w:color w:val="00B050"/>
+        </w:rPr>
+        <w:t>adp</w:t>
       </w:r>
       <w:proofErr w:type="spellEnd"/>
       <w:r>
@@ -5706,6 +6396,7 @@
         </w:rPr>
         <w:t>%}</w:t>
       </w:r>
+      <w:proofErr w:type="gramEnd"/>
     </w:p>
     <w:p>
       <w:pPr>
@@ -5770,7 +6461,15 @@
         <w:t>]</w:t>
       </w:r>
       <w:r>
-        <w:t xml:space="preserve"> for {{ cif.block.name }}. The anisotropic displacement factor exponent takes the form: −2π</w:t>
+        <w:t xml:space="preserve"> for </w:t>
+      </w:r>
+      <w:proofErr w:type="gramStart"/>
+      <w:r>
+        <w:t>{{ cif.block.name</w:t>
+      </w:r>
+      <w:proofErr w:type="gramEnd"/>
+      <w:r>
+        <w:t xml:space="preserve"> }}. The anisotropic displacement factor exponent takes the form: −2π</w:t>
       </w:r>
       <w:r>
         <w:rPr>
@@ -5862,6 +6561,7 @@
         </w:rPr>
         <w:t>2hka*b*U</w:t>
       </w:r>
+      <w:proofErr w:type="gramStart"/>
       <w:r>
         <w:rPr>
           <w:vertAlign w:val="subscript"/>
@@ -5871,6 +6571,7 @@
       <w:r>
         <w:t> ]</w:t>
       </w:r>
+      <w:proofErr w:type="gramEnd"/>
     </w:p>
     <w:tbl>
       <w:tblPr>
@@ -6090,14 +6791,22 @@
                 <w:color w:val="C00000"/>
                 <w:sz w:val="14"/>
               </w:rPr>
-              <w:t>displacement_parameters</w:t>
-            </w:r>
-            <w:proofErr w:type="spellEnd"/>
+              <w:t>displacement_</w:t>
+            </w:r>
+            <w:proofErr w:type="gramStart"/>
             <w:r>
               <w:rPr>
                 <w:color w:val="C00000"/>
                 <w:sz w:val="14"/>
               </w:rPr>
+              <w:t>parameters</w:t>
+            </w:r>
+            <w:proofErr w:type="spellEnd"/>
+            <w:r>
+              <w:rPr>
+                <w:color w:val="C00000"/>
+                <w:sz w:val="14"/>
+              </w:rPr>
               <w:t xml:space="preserve">  </w:t>
             </w:r>
             <w:r>
@@ -6106,6 +6815,7 @@
               </w:rPr>
               <w:t>%</w:t>
             </w:r>
+            <w:proofErr w:type="gramEnd"/>
             <w:r>
               <w:t>}</w:t>
             </w:r>
@@ -6181,6 +6891,7 @@
             <w:pPr>
               <w:jc w:val="both"/>
             </w:pPr>
+            <w:proofErr w:type="gramStart"/>
             <w:r>
               <w:t xml:space="preserve">{{ </w:t>
             </w:r>
@@ -6192,6 +6903,7 @@
               </w:rPr>
               <w:t>atom</w:t>
             </w:r>
+            <w:proofErr w:type="gramEnd"/>
             <w:r>
               <w:rPr>
                 <w:sz w:val="16"/>
@@ -6218,6 +6930,7 @@
             <w:pPr>
               <w:jc w:val="both"/>
             </w:pPr>
+            <w:proofErr w:type="gramStart"/>
             <w:r>
               <w:t xml:space="preserve">{{ </w:t>
             </w:r>
@@ -6227,6 +6940,7 @@
               </w:rPr>
               <w:t>atom</w:t>
             </w:r>
+            <w:proofErr w:type="gramEnd"/>
             <w:r>
               <w:t>.U11 }}</w:t>
             </w:r>
@@ -6240,6 +6954,7 @@
             <w:pPr>
               <w:jc w:val="both"/>
             </w:pPr>
+            <w:proofErr w:type="gramStart"/>
             <w:r>
               <w:t xml:space="preserve">{{ </w:t>
             </w:r>
@@ -6249,6 +6964,7 @@
               </w:rPr>
               <w:t>atom</w:t>
             </w:r>
+            <w:proofErr w:type="gramEnd"/>
             <w:r>
               <w:t>.U22 }}</w:t>
             </w:r>
@@ -6262,6 +6978,7 @@
             <w:pPr>
               <w:jc w:val="both"/>
             </w:pPr>
+            <w:proofErr w:type="gramStart"/>
             <w:r>
               <w:t xml:space="preserve">{{ </w:t>
             </w:r>
@@ -6271,6 +6988,7 @@
               </w:rPr>
               <w:t>atom</w:t>
             </w:r>
+            <w:proofErr w:type="gramEnd"/>
             <w:r>
               <w:t>.U33 }}</w:t>
             </w:r>
@@ -6284,6 +7002,7 @@
             <w:pPr>
               <w:jc w:val="both"/>
             </w:pPr>
+            <w:proofErr w:type="gramStart"/>
             <w:r>
               <w:t xml:space="preserve">{{ </w:t>
             </w:r>
@@ -6293,6 +7012,7 @@
               </w:rPr>
               <w:t>atom</w:t>
             </w:r>
+            <w:proofErr w:type="gramEnd"/>
             <w:r>
               <w:t>.U23 }}</w:t>
             </w:r>
@@ -6306,6 +7026,7 @@
             <w:pPr>
               <w:jc w:val="both"/>
             </w:pPr>
+            <w:proofErr w:type="gramStart"/>
             <w:r>
               <w:t xml:space="preserve">{{ </w:t>
             </w:r>
@@ -6315,6 +7036,7 @@
               </w:rPr>
               <w:t>atom</w:t>
             </w:r>
+            <w:proofErr w:type="gramEnd"/>
             <w:r>
               <w:t>.U13 }}</w:t>
             </w:r>
@@ -6328,6 +7050,7 @@
             <w:pPr>
               <w:jc w:val="both"/>
             </w:pPr>
+            <w:proofErr w:type="gramStart"/>
             <w:r>
               <w:t xml:space="preserve">{{ </w:t>
             </w:r>
@@ -6337,6 +7060,7 @@
               </w:rPr>
               <w:t>atom</w:t>
             </w:r>
+            <w:proofErr w:type="gramEnd"/>
             <w:r>
               <w:t>.U12 }}</w:t>
             </w:r>
@@ -6473,6 +7197,7 @@
         </w:rPr>
         <w:t xml:space="preserve"> </w:t>
       </w:r>
+      <w:proofErr w:type="gramStart"/>
       <w:r>
         <w:rPr>
           <w:color w:val="00B050"/>
@@ -6488,6 +7213,7 @@
         </w:rPr>
         <w:t>%}</w:t>
       </w:r>
+      <w:proofErr w:type="gramEnd"/>
     </w:p>
     <w:p>
       <w:pPr>
@@ -6509,7 +7235,15 @@
           <w:color w:val="7030A0"/>
           <w:szCs w:val="20"/>
         </w:rPr>
-        <w:t xml:space="preserve">if bonds </w:t>
+        <w:t xml:space="preserve">if </w:t>
+      </w:r>
+      <w:proofErr w:type="gramStart"/>
+      <w:r>
+        <w:rPr>
+          <w:color w:val="7030A0"/>
+          <w:szCs w:val="20"/>
+        </w:rPr>
+        <w:t xml:space="preserve">bonds </w:t>
       </w:r>
       <w:r>
         <w:rPr>
@@ -6518,6 +7252,7 @@
         </w:rPr>
         <w:t>%}</w:t>
       </w:r>
+      <w:proofErr w:type="gramEnd"/>
     </w:p>
     <w:p>
       <w:pPr>
@@ -6551,7 +7286,15 @@
         <w:fldChar w:fldCharType="end"/>
       </w:r>
       <w:r>
-        <w:t xml:space="preserve"> Bond lengths and angles for {{ cif.block.name }}</w:t>
+        <w:t xml:space="preserve"> Bond lengths and angles for </w:t>
+      </w:r>
+      <w:proofErr w:type="gramStart"/>
+      <w:r>
+        <w:t>{{ cif.block.name</w:t>
+      </w:r>
+      <w:proofErr w:type="gramEnd"/>
+      <w:r>
+        <w:t xml:space="preserve"> }}</w:t>
       </w:r>
     </w:p>
     <w:tbl>
@@ -6591,6 +7334,7 @@
                 <w:tab w:val="decimal" w:pos="227"/>
               </w:tabs>
             </w:pPr>
+            <w:proofErr w:type="gramStart"/>
             <w:r>
               <w:rPr>
                 <w:b/>
@@ -6605,6 +7349,7 @@
               <w:t>{{</w:t>
             </w:r>
             <w:proofErr w:type="spellStart"/>
+            <w:proofErr w:type="gramEnd"/>
             <w:r>
               <w:rPr>
                 <w:rFonts w:cstheme="minorHAnsi"/>
@@ -6672,6 +7417,7 @@
             <w:tcW w:w="2098" w:type="dxa"/>
           </w:tcPr>
           <w:p>
+            <w:proofErr w:type="gramStart"/>
             <w:r>
               <w:t>{{</w:t>
             </w:r>
@@ -6682,6 +7428,7 @@
             <w:r>
               <w:t>b</w:t>
             </w:r>
+            <w:proofErr w:type="gramEnd"/>
             <w:r>
               <w:t>.</w:t>
             </w:r>
@@ -6702,6 +7449,7 @@
             <w:tcW w:w="1417" w:type="dxa"/>
           </w:tcPr>
           <w:p>
+            <w:proofErr w:type="gramStart"/>
             <w:r>
               <w:t>{{</w:t>
             </w:r>
@@ -6710,7 +7458,11 @@
             </w:r>
             <w:proofErr w:type="spellStart"/>
             <w:r>
-              <w:t>b.dist</w:t>
+              <w:t>b</w:t>
+            </w:r>
+            <w:proofErr w:type="gramEnd"/>
+            <w:r>
+              <w:t>.dist</w:t>
             </w:r>
             <w:proofErr w:type="spellEnd"/>
             <w:r>
@@ -6862,6 +7614,7 @@
             <w:tcW w:w="2098" w:type="dxa"/>
           </w:tcPr>
           <w:p>
+            <w:proofErr w:type="gramStart"/>
             <w:r>
               <w:t>{{</w:t>
             </w:r>
@@ -6870,7 +7623,11 @@
             </w:r>
             <w:proofErr w:type="spellStart"/>
             <w:r>
-              <w:t>a.atoms</w:t>
+              <w:t>a</w:t>
+            </w:r>
+            <w:proofErr w:type="gramEnd"/>
+            <w:r>
+              <w:t>.atoms</w:t>
             </w:r>
             <w:proofErr w:type="spellEnd"/>
             <w:r>
@@ -6886,6 +7643,7 @@
             <w:tcW w:w="1417" w:type="dxa"/>
           </w:tcPr>
           <w:p>
+            <w:proofErr w:type="gramStart"/>
             <w:r>
               <w:t>{{</w:t>
             </w:r>
@@ -6894,7 +7652,11 @@
             </w:r>
             <w:proofErr w:type="spellStart"/>
             <w:r>
-              <w:t>a.angle</w:t>
+              <w:t>a</w:t>
+            </w:r>
+            <w:proofErr w:type="gramEnd"/>
+            <w:r>
+              <w:t>.angle</w:t>
             </w:r>
             <w:proofErr w:type="spellEnd"/>
             <w:r>
@@ -6978,6 +7740,7 @@
         <w:t xml:space="preserve"> </w:t>
       </w:r>
       <w:proofErr w:type="spellStart"/>
+      <w:proofErr w:type="gramStart"/>
       <w:r>
         <w:rPr>
           <w:color w:val="ED7D31" w:themeColor="accent2"/>
@@ -6988,7 +7751,14 @@
         <w:rPr>
           <w:color w:val="ED7D31" w:themeColor="accent2"/>
         </w:rPr>
-        <w:t>without_h</w:t>
+        <w:t>without</w:t>
+      </w:r>
+      <w:proofErr w:type="gramEnd"/>
+      <w:r>
+        <w:rPr>
+          <w:color w:val="ED7D31" w:themeColor="accent2"/>
+        </w:rPr>
+        <w:t>_h</w:t>
       </w:r>
       <w:proofErr w:type="spellEnd"/>
       <w:r>
@@ -6997,8 +7767,13 @@
         </w:rPr>
         <w:t xml:space="preserve"> </w:t>
       </w:r>
-      <w:r>
-        <w:t xml:space="preserve">%}Bonds </w:t>
+      <w:proofErr w:type="gramStart"/>
+      <w:r>
+        <w:t>%}Bonds</w:t>
+      </w:r>
+      <w:proofErr w:type="gramEnd"/>
+      <w:r>
+        <w:t xml:space="preserve"> </w:t>
       </w:r>
       <w:r>
         <w:t xml:space="preserve">and angles </w:t>
@@ -7026,11 +7801,16 @@
         </w:rPr>
         <w:t xml:space="preserve">endif </w:t>
       </w:r>
+      <w:proofErr w:type="gramStart"/>
       <w:r>
         <w:t>%}</w:t>
       </w:r>
       <w:r>
-        <w:t>{%</w:t>
+        <w:t>{</w:t>
+      </w:r>
+      <w:proofErr w:type="gramEnd"/>
+      <w:r>
+        <w:t>%</w:t>
       </w:r>
       <w:r>
         <w:t xml:space="preserve"> </w:t>
@@ -7055,8 +7835,13 @@
         </w:rPr>
         <w:t xml:space="preserve"> </w:t>
       </w:r>
-      <w:r>
-        <w:t>%}{{</w:t>
+      <w:proofErr w:type="gramStart"/>
+      <w:r>
+        <w:t>%}{</w:t>
+      </w:r>
+      <w:proofErr w:type="gramEnd"/>
+      <w:r>
+        <w:t>{</w:t>
       </w:r>
       <w:r>
         <w:t>r</w:t>
@@ -7066,18 +7851,27 @@
       </w:r>
       <w:proofErr w:type="spellStart"/>
       <w:r>
-        <w:t>ba_symminfo</w:t>
+        <w:t>ba_</w:t>
+      </w:r>
+      <w:proofErr w:type="gramStart"/>
+      <w:r>
+        <w:t>symminfo</w:t>
       </w:r>
       <w:proofErr w:type="spellEnd"/>
       <w:r>
         <w:t xml:space="preserve"> </w:t>
       </w:r>
       <w:r>
-        <w:t>}}{%</w:t>
+        <w:t>}}{</w:t>
+      </w:r>
+      <w:proofErr w:type="gramEnd"/>
+      <w:r>
+        <w:t>%</w:t>
       </w:r>
       <w:r>
         <w:t xml:space="preserve"> </w:t>
       </w:r>
+      <w:proofErr w:type="gramStart"/>
       <w:r>
         <w:rPr>
           <w:color w:val="00B050"/>
@@ -7093,6 +7887,7 @@
       <w:r>
         <w:t>%}</w:t>
       </w:r>
+      <w:proofErr w:type="gramEnd"/>
     </w:p>
     <w:p>
       <w:pPr>
@@ -7108,6 +7903,7 @@
         </w:rPr>
         <w:t xml:space="preserve">{%p </w:t>
       </w:r>
+      <w:proofErr w:type="gramStart"/>
       <w:r>
         <w:rPr>
           <w:color w:val="7030A0"/>
@@ -7122,6 +7918,7 @@
         </w:rPr>
         <w:t>%}</w:t>
       </w:r>
+      <w:proofErr w:type="gramEnd"/>
     </w:p>
     <w:p/>
     <w:p>
@@ -7162,11 +7959,19 @@
         <w:rPr>
           <w:color w:val="7030A0"/>
         </w:rPr>
-        <w:t>if torsions%</w:t>
+        <w:t xml:space="preserve">if </w:t>
+      </w:r>
+      <w:proofErr w:type="gramStart"/>
+      <w:r>
+        <w:rPr>
+          <w:color w:val="7030A0"/>
+        </w:rPr>
+        <w:t>torsions%</w:t>
       </w:r>
       <w:r>
         <w:t>}</w:t>
       </w:r>
+      <w:proofErr w:type="gramEnd"/>
     </w:p>
     <w:p>
       <w:pPr>
@@ -7209,7 +8014,15 @@
         <w:fldChar w:fldCharType="end"/>
       </w:r>
       <w:r>
-        <w:t xml:space="preserve"> Torsion angles for {{ cif.block.name }}</w:t>
+        <w:t xml:space="preserve"> Torsion angles for </w:t>
+      </w:r>
+      <w:proofErr w:type="gramStart"/>
+      <w:r>
+        <w:t>{{ cif.block.name</w:t>
+      </w:r>
+      <w:proofErr w:type="gramEnd"/>
+      <w:r>
+        <w:t xml:space="preserve"> }}</w:t>
       </w:r>
     </w:p>
     <w:p>
@@ -7327,6 +8140,7 @@
             <w:tcW w:w="2381" w:type="dxa"/>
           </w:tcPr>
           <w:p>
+            <w:proofErr w:type="gramStart"/>
             <w:r>
               <w:t>{{</w:t>
             </w:r>
@@ -7337,6 +8151,7 @@
             <w:r>
               <w:t>t</w:t>
             </w:r>
+            <w:proofErr w:type="gramEnd"/>
             <w:r>
               <w:t>.atoms</w:t>
             </w:r>
@@ -7354,6 +8169,7 @@
             <w:tcW w:w="1701" w:type="dxa"/>
           </w:tcPr>
           <w:p>
+            <w:proofErr w:type="gramStart"/>
             <w:r>
               <w:t>{{</w:t>
             </w:r>
@@ -7364,6 +8180,7 @@
             <w:r>
               <w:t>t</w:t>
             </w:r>
+            <w:proofErr w:type="gramEnd"/>
             <w:r>
               <w:t>.</w:t>
             </w:r>
@@ -7438,11 +8255,19 @@
         <w:t xml:space="preserve">if </w:t>
       </w:r>
       <w:proofErr w:type="spellStart"/>
+      <w:proofErr w:type="gramStart"/>
       <w:r>
         <w:rPr>
           <w:color w:val="ED7D31" w:themeColor="accent2"/>
         </w:rPr>
-        <w:t>options.without_h</w:t>
+        <w:t>options.without</w:t>
+      </w:r>
+      <w:proofErr w:type="gramEnd"/>
+      <w:r>
+        <w:rPr>
+          <w:color w:val="ED7D31" w:themeColor="accent2"/>
+        </w:rPr>
+        <w:t>_h</w:t>
       </w:r>
       <w:proofErr w:type="spellEnd"/>
       <w:r>
@@ -7451,11 +8276,16 @@
         </w:rPr>
         <w:t xml:space="preserve"> </w:t>
       </w:r>
+      <w:proofErr w:type="gramStart"/>
       <w:r>
         <w:t>%}</w:t>
       </w:r>
       <w:r>
-        <w:t>Bonds and angles to hydrogen atoms were omitted.</w:t>
+        <w:t>Bonds</w:t>
+      </w:r>
+      <w:proofErr w:type="gramEnd"/>
+      <w:r>
+        <w:t xml:space="preserve"> and angles to hydrogen atoms were omitted.</w:t>
       </w:r>
     </w:p>
     <w:p>
@@ -7477,11 +8307,16 @@
         </w:rPr>
         <w:t xml:space="preserve">endif </w:t>
       </w:r>
+      <w:proofErr w:type="gramStart"/>
       <w:r>
         <w:t>%}</w:t>
       </w:r>
       <w:r>
-        <w:t>{%</w:t>
+        <w:t>{</w:t>
+      </w:r>
+      <w:proofErr w:type="gramEnd"/>
+      <w:r>
+        <w:t>%</w:t>
       </w:r>
       <w:r>
         <w:t xml:space="preserve"> </w:t>
@@ -7497,8 +8332,13 @@
       <w:r>
         <w:t xml:space="preserve"> </w:t>
       </w:r>
-      <w:r>
-        <w:t>%}{{</w:t>
+      <w:proofErr w:type="gramStart"/>
+      <w:r>
+        <w:t>%}{</w:t>
+      </w:r>
+      <w:proofErr w:type="gramEnd"/>
+      <w:r>
+        <w:t>{</w:t>
       </w:r>
       <w:r>
         <w:t>r</w:t>
@@ -7508,18 +8348,27 @@
       </w:r>
       <w:proofErr w:type="spellStart"/>
       <w:r>
-        <w:t>torsion_symminfo</w:t>
+        <w:t>torsion_</w:t>
+      </w:r>
+      <w:proofErr w:type="gramStart"/>
+      <w:r>
+        <w:t>symminfo</w:t>
       </w:r>
       <w:proofErr w:type="spellEnd"/>
       <w:r>
         <w:t xml:space="preserve"> </w:t>
       </w:r>
       <w:r>
-        <w:t>}}{%</w:t>
+        <w:t>}}{</w:t>
+      </w:r>
+      <w:proofErr w:type="gramEnd"/>
+      <w:r>
+        <w:t>%</w:t>
       </w:r>
       <w:r>
         <w:t xml:space="preserve"> </w:t>
       </w:r>
+      <w:proofErr w:type="gramStart"/>
       <w:r>
         <w:t>endif</w:t>
       </w:r>
@@ -7529,6 +8378,7 @@
       <w:r>
         <w:t>%}</w:t>
       </w:r>
+      <w:proofErr w:type="gramEnd"/>
     </w:p>
     <w:p>
       <w:pPr>
@@ -7552,6 +8402,7 @@
         </w:rPr>
         <w:t xml:space="preserve">p </w:t>
       </w:r>
+      <w:proofErr w:type="gramStart"/>
       <w:r>
         <w:rPr>
           <w:color w:val="7030A0"/>
@@ -7580,6 +8431,7 @@
         </w:rPr>
         <w:t>}</w:t>
       </w:r>
+      <w:proofErr w:type="gramEnd"/>
     </w:p>
     <w:p>
       <w:pPr>
@@ -7623,7 +8475,15 @@
           <w:color w:val="FFC000" w:themeColor="accent4"/>
           <w:szCs w:val="26"/>
         </w:rPr>
-        <w:t>hydrogen_bonds</w:t>
+        <w:t>hydrogen_</w:t>
+      </w:r>
+      <w:proofErr w:type="gramStart"/>
+      <w:r>
+        <w:rPr>
+          <w:color w:val="FFC000" w:themeColor="accent4"/>
+          <w:szCs w:val="26"/>
+        </w:rPr>
+        <w:t>bonds</w:t>
       </w:r>
       <w:proofErr w:type="spellEnd"/>
       <w:r>
@@ -7632,6 +8492,7 @@
       <w:r>
         <w:t>%}</w:t>
       </w:r>
+      <w:proofErr w:type="gramEnd"/>
     </w:p>
     <w:p>
       <w:pPr>
@@ -7659,7 +8520,15 @@
         <w:fldChar w:fldCharType="end"/>
       </w:r>
       <w:r>
-        <w:t xml:space="preserve"> Hydrogen bonds for {{ cif.block.name }}</w:t>
+        <w:t xml:space="preserve"> Hydrogen bonds for </w:t>
+      </w:r>
+      <w:proofErr w:type="gramStart"/>
+      <w:r>
+        <w:t>{{ cif.block.name</w:t>
+      </w:r>
+      <w:proofErr w:type="gramEnd"/>
+      <w:r>
+        <w:t xml:space="preserve"> }}</w:t>
       </w:r>
     </w:p>
     <w:tbl>
@@ -7954,10 +8823,12 @@
               <w:t>{{</w:t>
             </w:r>
             <w:proofErr w:type="spellStart"/>
+            <w:proofErr w:type="gramStart"/>
             <w:r>
               <w:t>h.atoms</w:t>
             </w:r>
             <w:proofErr w:type="spellEnd"/>
+            <w:proofErr w:type="gramEnd"/>
             <w:r>
               <w:t>}}</w:t>
             </w:r>
@@ -7972,11 +8843,19 @@
               <w:t>{{</w:t>
             </w:r>
             <w:proofErr w:type="spellStart"/>
+            <w:proofErr w:type="gramStart"/>
             <w:r>
               <w:rPr>
                 <w:sz w:val="16"/>
               </w:rPr>
-              <w:t>h.dist_dh</w:t>
+              <w:t>h.dist</w:t>
+            </w:r>
+            <w:proofErr w:type="gramEnd"/>
+            <w:r>
+              <w:rPr>
+                <w:sz w:val="16"/>
+              </w:rPr>
+              <w:t>_dh</w:t>
             </w:r>
             <w:proofErr w:type="spellEnd"/>
             <w:r>
@@ -7993,11 +8872,19 @@
               <w:t>{{</w:t>
             </w:r>
             <w:proofErr w:type="spellStart"/>
+            <w:proofErr w:type="gramStart"/>
             <w:r>
               <w:rPr>
                 <w:sz w:val="16"/>
               </w:rPr>
-              <w:t>h.dist_ha</w:t>
+              <w:t>h.dist</w:t>
+            </w:r>
+            <w:proofErr w:type="gramEnd"/>
+            <w:r>
+              <w:rPr>
+                <w:sz w:val="16"/>
+              </w:rPr>
+              <w:t>_ha</w:t>
             </w:r>
             <w:proofErr w:type="spellEnd"/>
             <w:r>
@@ -8014,11 +8901,19 @@
               <w:t>{{</w:t>
             </w:r>
             <w:proofErr w:type="spellStart"/>
+            <w:proofErr w:type="gramStart"/>
             <w:r>
               <w:rPr>
                 <w:sz w:val="16"/>
               </w:rPr>
-              <w:t>h.dist_da</w:t>
+              <w:t>h.dist</w:t>
+            </w:r>
+            <w:proofErr w:type="gramEnd"/>
+            <w:r>
+              <w:rPr>
+                <w:sz w:val="16"/>
+              </w:rPr>
+              <w:t>_da</w:t>
             </w:r>
             <w:proofErr w:type="spellEnd"/>
             <w:r>
@@ -8035,11 +8930,19 @@
               <w:t>{{</w:t>
             </w:r>
             <w:proofErr w:type="spellStart"/>
+            <w:proofErr w:type="gramStart"/>
             <w:r>
               <w:rPr>
                 <w:sz w:val="16"/>
               </w:rPr>
-              <w:t>h.angle_dha</w:t>
+              <w:t>h.angle</w:t>
+            </w:r>
+            <w:proofErr w:type="gramEnd"/>
+            <w:r>
+              <w:rPr>
+                <w:sz w:val="16"/>
+              </w:rPr>
+              <w:t>_dha</w:t>
             </w:r>
             <w:proofErr w:type="spellEnd"/>
             <w:r>
@@ -8146,15 +9049,24 @@
         </w:rPr>
         <w:t xml:space="preserve"> </w:t>
       </w:r>
-      <w:r>
-        <w:t>%}{{</w:t>
+      <w:proofErr w:type="gramStart"/>
+      <w:r>
+        <w:t>%}{</w:t>
+      </w:r>
+      <w:proofErr w:type="gramEnd"/>
+      <w:r>
+        <w:t>{</w:t>
       </w:r>
       <w:r>
         <w:t xml:space="preserve">r </w:t>
       </w:r>
       <w:proofErr w:type="spellStart"/>
       <w:r>
-        <w:t>hydrogen_sy</w:t>
+        <w:t>hydrogen_</w:t>
+      </w:r>
+      <w:proofErr w:type="gramStart"/>
+      <w:r>
+        <w:t>sy</w:t>
       </w:r>
       <w:r>
         <w:t>m</w:t>
@@ -8167,11 +9079,16 @@
         <w:t xml:space="preserve"> </w:t>
       </w:r>
       <w:r>
-        <w:t>}}{%</w:t>
+        <w:t>}}{</w:t>
+      </w:r>
+      <w:proofErr w:type="gramEnd"/>
+      <w:r>
+        <w:t>%</w:t>
       </w:r>
       <w:r>
         <w:t xml:space="preserve"> </w:t>
       </w:r>
+      <w:proofErr w:type="gramStart"/>
       <w:r>
         <w:rPr>
           <w:color w:val="70AD47" w:themeColor="accent6"/>
@@ -8187,6 +9104,7 @@
       <w:r>
         <w:t>%}</w:t>
       </w:r>
+      <w:proofErr w:type="gramEnd"/>
     </w:p>
     <w:p>
       <w:pPr>
@@ -8206,6 +9124,7 @@
         </w:rPr>
         <w:t xml:space="preserve">p </w:t>
       </w:r>
+      <w:proofErr w:type="gramStart"/>
       <w:r>
         <w:rPr>
           <w:color w:val="FFC000" w:themeColor="accent4"/>
@@ -8226,6 +9145,7 @@
         </w:rPr>
         <w:t>%}</w:t>
       </w:r>
+      <w:proofErr w:type="gramEnd"/>
     </w:p>
     <w:p>
       <w:r>
@@ -8240,26 +9160,46 @@
         <w:t xml:space="preserve">if </w:t>
       </w:r>
       <w:proofErr w:type="spellStart"/>
+      <w:proofErr w:type="gramStart"/>
       <w:r>
         <w:rPr>
           <w:color w:val="C00000"/>
           <w:sz w:val="16"/>
           <w:szCs w:val="20"/>
         </w:rPr>
-        <w:t>options.report_text</w:t>
-      </w:r>
-      <w:proofErr w:type="spellEnd"/>
+        <w:t>options.report</w:t>
+      </w:r>
+      <w:proofErr w:type="gramEnd"/>
       <w:r>
         <w:rPr>
           <w:color w:val="C00000"/>
           <w:sz w:val="16"/>
           <w:szCs w:val="20"/>
         </w:rPr>
+        <w:t>_</w:t>
+      </w:r>
+      <w:proofErr w:type="gramStart"/>
+      <w:r>
+        <w:rPr>
+          <w:color w:val="C00000"/>
+          <w:sz w:val="16"/>
+          <w:szCs w:val="20"/>
+        </w:rPr>
+        <w:t>text</w:t>
+      </w:r>
+      <w:proofErr w:type="spellEnd"/>
+      <w:r>
+        <w:rPr>
+          <w:color w:val="C00000"/>
+          <w:sz w:val="16"/>
+          <w:szCs w:val="20"/>
+        </w:rPr>
         <w:t xml:space="preserve"> </w:t>
       </w:r>
       <w:r>
         <w:t>%}</w:t>
       </w:r>
+      <w:proofErr w:type="gramEnd"/>
     </w:p>
     <w:p>
       <w:pPr>
@@ -8292,6 +9232,7 @@
         <w:t xml:space="preserve"> in </w:t>
       </w:r>
       <w:proofErr w:type="spellStart"/>
+      <w:proofErr w:type="gramStart"/>
       <w:r>
         <w:t>references</w:t>
       </w:r>
@@ -8299,12 +9240,18 @@
         <w:t>.items</w:t>
       </w:r>
       <w:proofErr w:type="spellEnd"/>
-      <w:r>
-        <w:t>()</w:t>
+      <w:proofErr w:type="gramEnd"/>
+      <w:r>
+        <w:t>(</w:t>
+      </w:r>
+      <w:proofErr w:type="gramStart"/>
+      <w:r>
+        <w:t>)</w:t>
       </w:r>
       <w:r>
         <w:t xml:space="preserve"> %}</w:t>
       </w:r>
+      <w:proofErr w:type="gramEnd"/>
     </w:p>
     <w:p>
       <w:pPr>
@@ -8313,6 +9260,7 @@
       <w:r>
         <w:t>[</w:t>
       </w:r>
+      <w:proofErr w:type="gramStart"/>
       <w:r>
         <w:t>{{</w:t>
       </w:r>
@@ -8323,8 +9271,13 @@
       <w:r>
         <w:t>num</w:t>
       </w:r>
-      <w:r>
-        <w:t>|e</w:t>
+      <w:proofErr w:type="gramEnd"/>
+      <w:r>
+        <w:t>|</w:t>
+      </w:r>
+      <w:proofErr w:type="gramStart"/>
+      <w:r>
+        <w:t>e</w:t>
       </w:r>
       <w:proofErr w:type="spellEnd"/>
       <w:r>
@@ -8342,9 +9295,11 @@
       <w:r>
         <w:t>“</w:t>
       </w:r>
+      <w:proofErr w:type="gramEnd"/>
       <w:r>
         <w:t>\t</w:t>
       </w:r>
+      <w:proofErr w:type="gramStart"/>
       <w:r>
         <w:t xml:space="preserve">” </w:t>
       </w:r>
@@ -8361,6 +9316,7 @@
       <w:r>
         <w:t>ref</w:t>
       </w:r>
+      <w:proofErr w:type="gramEnd"/>
       <w:r>
         <w:t>.richtext|e</w:t>
       </w:r>
@@ -8380,6 +9336,7 @@
         <w:t xml:space="preserve"> </w:t>
       </w:r>
       <w:proofErr w:type="spellStart"/>
+      <w:proofErr w:type="gramStart"/>
       <w:r>
         <w:t>endfor</w:t>
       </w:r>
@@ -8390,6 +9347,7 @@
       <w:r>
         <w:t>%}</w:t>
       </w:r>
+      <w:proofErr w:type="gramEnd"/>
     </w:p>
     <w:p>
       <w:r>
@@ -9439,7 +10397,6 @@
   <w:style w:type="character" w:default="1" w:styleId="DefaultParagraphFont">
     <w:name w:val="Default Paragraph Font"/>
     <w:uiPriority w:val="1"/>
-    <w:semiHidden/>
     <w:unhideWhenUsed/>
   </w:style>
   <w:style w:type="table" w:default="1" w:styleId="TableNormal">

</xml_diff>